<commit_message>
Add PlanetSpark market-position context to the company description line
Kshitiz confirmed PlanetSpark is one of India's largest public speaking and
creative writing platforms. Adding this as company-positioning context in
the experience intro line (true of the company, useful for any resume) --
explicitly NOT counted as satisfying a "market share growth" JD keyword,
since that's a personal-skill claim the context doesn't actually back.
Regenerated the base resume + both tailored variants; match scores
unchanged (94% Velocitai, 74% Vishal Mega Mart) since this doesn't affect
keyword coverage.

Co-Authored-By: Claude Sonnet 5 <noreply@anthropic.com>
</commit_message>
<xml_diff>
--- a/resumes/Kshitiz Yadav - Product Manager Resume.docx
+++ b/resumes/Kshitiz Yadav - Product Manager Resume.docx
@@ -138,7 +138,7 @@
           <w:color w:val="333333"/>
           <w:sz w:val="19"/>
         </w:rPr>
-        <w:t>Own the full product suite of a B2C EdTech startup: consumer app, student &amp; teacher LMS, sales CRM, product-led growth &amp; renewal engine, and an in-house AI layer.</w:t>
+        <w:t>Own the full product suite of a B2C EdTech startup -- one of India's largest public speaking &amp; creative writing platforms: consumer app, student &amp; teacher LMS, sales CRM, product-led growth &amp; renewal engine, and an in-house AI layer.</w:t>
       </w:r>
     </w:p>
     <w:p>
@@ -505,7 +505,7 @@
       <w:r>
         <w:rPr>
           <w:rFonts w:ascii="Calibri" w:hAnsi="Calibri"/>
-          <w:b w:val="0"/>
+          <w:b/>
           <w:i w:val="0"/>
           <w:sz w:val="19"/>
         </w:rPr>

</xml_diff>

<commit_message>
Add auto-fit page filling to resume builder (exactly 1 full page)
build_resume.render() is now style-driven; new fit_to_page() renders -> PDF
(LibreOffice) -> measures real page count + vertical fill and auto-selects the
loosest ATS-safe preset (9.5-11pt) that fills one page cleanly (~93-98%), never
spilling to page 2. Base resume went from 81% full (2" of dead space) to 93.5%
at 10pt. Documents the one-page-full rule + toolchain (venv, LibreOffice,
poppler) in CLAUDE.md so every future resume comes out clean and full.

Co-Authored-By: Claude Opus 4.8 <noreply@anthropic.com>
</commit_message>
<xml_diff>
--- a/resumes/Kshitiz Yadav - Product Manager Resume.docx
+++ b/resumes/Kshitiz Yadav - Product Manager Resume.docx
@@ -13,7 +13,7 @@
           <w:b/>
           <w:i w:val="0"/>
           <w:color w:val="1F3864"/>
-          <w:sz w:val="34"/>
+          <w:sz w:val="35"/>
         </w:rPr>
         <w:t>KSHITIZ YADAV</w:t>
       </w:r>
@@ -29,14 +29,14 @@
           <w:b w:val="0"/>
           <w:i w:val="0"/>
           <w:color w:val="444444"/>
-          <w:sz w:val="19"/>
+          <w:sz w:val="20"/>
         </w:rPr>
         <w:t>Product Manager  |  B2C Consumer Apps  |  Growth &amp; Monetization  |  Two-Sided Platforms  |  AI-Enabled</w:t>
       </w:r>
     </w:p>
     <w:p>
       <w:pPr>
-        <w:spacing w:after="20"/>
+        <w:spacing w:after="40"/>
         <w:jc w:val="center"/>
       </w:pPr>
       <w:r>
@@ -45,14 +45,14 @@
           <w:b w:val="0"/>
           <w:i w:val="0"/>
           <w:color w:val="444444"/>
-          <w:sz w:val="18"/>
+          <w:sz w:val="19"/>
         </w:rPr>
         <w:t>Gurugram, India  •  +91 8756972501  •  kshitizyadav788@gmail.com  •  linkedin.com/in/kshitizyadav</w:t>
       </w:r>
     </w:p>
     <w:p>
       <w:pPr>
-        <w:spacing w:before="100" w:after="40"/>
+        <w:spacing w:before="120" w:after="50"/>
         <w:pBdr>
           <w:bottom w:val="single" w:sz="6" w:space="1" w:color="2E5AAC"/>
         </w:pBdr>
@@ -62,28 +62,28 @@
           <w:rFonts w:ascii="Calibri" w:hAnsi="Calibri"/>
           <w:b/>
           <w:color w:val="1F3864"/>
-          <w:sz w:val="22"/>
+          <w:sz w:val="23"/>
         </w:rPr>
         <w:t>PROFESSIONAL SUMMARY</w:t>
       </w:r>
     </w:p>
     <w:p>
       <w:pPr>
-        <w:spacing w:after="20"/>
+        <w:spacing w:after="40"/>
       </w:pPr>
       <w:r>
         <w:rPr>
           <w:rFonts w:ascii="Calibri" w:hAnsi="Calibri"/>
           <w:b w:val="0"/>
           <w:i w:val="0"/>
-          <w:sz w:val="19"/>
+          <w:sz w:val="20"/>
         </w:rPr>
         <w:t>Product Manager with 5+ years owning the full B2C product lifecycle across a consumer app, a two-sided student/teacher LMS, a sales CRM, and a product-led growth &amp; renewal engine at a high-growth EdTech startup. Consistent record of moving core metrics — 20% revenue growth, 25% ARPU expansion, ₹70L in product-led renewals, and 2,000+ organic leads/month at 7% conversion. Pairs monetization and unit-economics thinking with hands-on data analysis (SQL, GA4), A/B testing, and shipping production GenAI features; works across engineering, design, marketing, sales, and operations.</w:t>
       </w:r>
     </w:p>
     <w:p>
       <w:pPr>
-        <w:spacing w:before="100" w:after="40"/>
+        <w:spacing w:before="120" w:after="50"/>
         <w:pBdr>
           <w:bottom w:val="single" w:sz="6" w:space="1" w:color="2E5AAC"/>
         </w:pBdr>
@@ -93,7 +93,7 @@
           <w:rFonts w:ascii="Calibri" w:hAnsi="Calibri"/>
           <w:b/>
           <w:color w:val="1F3864"/>
-          <w:sz w:val="22"/>
+          <w:sz w:val="23"/>
         </w:rPr>
         <w:t>PROFESSIONAL EXPERIENCE</w:t>
       </w:r>
@@ -110,7 +110,7 @@
           <w:rFonts w:ascii="Calibri" w:hAnsi="Calibri"/>
           <w:b/>
           <w:i w:val="0"/>
-          <w:sz w:val="21"/>
+          <w:sz w:val="22"/>
         </w:rPr>
         <w:t>PlanetSpark — Product Manager</w:t>
       </w:r>
@@ -120,7 +120,7 @@
           <w:b w:val="0"/>
           <w:i w:val="0"/>
           <w:color w:val="444444"/>
-          <w:sz w:val="19"/>
+          <w:sz w:val="20"/>
         </w:rPr>
         <w:tab/>
         <w:t>Gurugram · Mar 2021 – Present</w:t>
@@ -128,7 +128,7 @@
     </w:p>
     <w:p>
       <w:pPr>
-        <w:spacing w:after="20"/>
+        <w:spacing w:after="40"/>
       </w:pPr>
       <w:r>
         <w:rPr>
@@ -136,14 +136,14 @@
           <w:b w:val="0"/>
           <w:i/>
           <w:color w:val="333333"/>
-          <w:sz w:val="19"/>
+          <w:sz w:val="20"/>
         </w:rPr>
         <w:t>Own the full product suite of a B2C EdTech marketplace -- one of India's largest public speaking &amp; creative writing platforms, connecting students and teachers via a shared LMS: consumer app, student &amp; teacher LMS, sales CRM, product-led growth &amp; renewal engine, and an in-house AI layer.</w:t>
       </w:r>
     </w:p>
     <w:p>
       <w:pPr>
-        <w:spacing w:before="60" w:after="0"/>
+        <w:spacing w:before="70" w:after="0"/>
       </w:pPr>
       <w:r>
         <w:rPr>
@@ -151,7 +151,7 @@
           <w:b/>
           <w:i/>
           <w:color w:val="2E5AAC"/>
-          <w:sz w:val="19"/>
+          <w:sz w:val="20"/>
         </w:rPr>
         <w:t>Growth &amp; Monetization</w:t>
       </w:r>
@@ -159,14 +159,14 @@
     <w:p>
       <w:pPr>
         <w:pStyle w:val="ListBullet"/>
-        <w:spacing w:after="20" w:before="0" w:line="240" w:lineRule="auto"/>
+        <w:spacing w:after="40" w:before="0" w:line="254" w:lineRule="auto"/>
       </w:pPr>
       <w:r>
         <w:rPr>
           <w:rFonts w:ascii="Calibri" w:hAnsi="Calibri"/>
           <w:b w:val="0"/>
           <w:i w:val="0"/>
-          <w:sz w:val="19"/>
+          <w:sz w:val="20"/>
         </w:rPr>
         <w:t>Built the LPP (Learn, Practice, Perform) module — customized 1:1 sessions, group activities, and performance tasks — driving 20% revenue growth, 25% ARPU expansion (₹35K → ₹45K), and 50% higher revenue per class (₹600 → ₹900).</w:t>
       </w:r>
@@ -174,14 +174,14 @@
     <w:p>
       <w:pPr>
         <w:pStyle w:val="ListBullet"/>
-        <w:spacing w:after="20" w:before="0" w:line="240" w:lineRule="auto"/>
+        <w:spacing w:after="40" w:before="0" w:line="254" w:lineRule="auto"/>
       </w:pPr>
       <w:r>
         <w:rPr>
           <w:rFonts w:ascii="Calibri" w:hAnsi="Calibri"/>
           <w:b w:val="0"/>
           <w:i w:val="0"/>
-          <w:sz w:val="19"/>
+          <w:sz w:val="20"/>
         </w:rPr>
         <w:t>Designed an in-product renewal engine (nudges, early-bird access, LMS free-trial classes, teacher-initiated renewals) that lowered sales cost and generated ₹70L in renewals in a single month (Jan 2025).</w:t>
       </w:r>
@@ -189,21 +189,21 @@
     <w:p>
       <w:pPr>
         <w:pStyle w:val="ListBullet"/>
-        <w:spacing w:after="20" w:before="0" w:line="240" w:lineRule="auto"/>
+        <w:spacing w:after="40" w:before="0" w:line="254" w:lineRule="auto"/>
       </w:pPr>
       <w:r>
         <w:rPr>
           <w:rFonts w:ascii="Calibri" w:hAnsi="Calibri"/>
           <w:b w:val="0"/>
           <w:i w:val="0"/>
-          <w:sz w:val="19"/>
+          <w:sz w:val="20"/>
         </w:rPr>
         <w:t>Launched organic acquisition loops surfacing student progress (Sparkline, Word Wisdom, practice classes, workshops) across social channels, bringing 2,000+ organic leads/month at a 7% conversion rate.</w:t>
       </w:r>
     </w:p>
     <w:p>
       <w:pPr>
-        <w:spacing w:before="60" w:after="0"/>
+        <w:spacing w:before="70" w:after="0"/>
       </w:pPr>
       <w:r>
         <w:rPr>
@@ -211,7 +211,7 @@
           <w:b/>
           <w:i/>
           <w:color w:val="2E5AAC"/>
-          <w:sz w:val="19"/>
+          <w:sz w:val="20"/>
         </w:rPr>
         <w:t>Funnel &amp; Platform (0→1)</w:t>
       </w:r>
@@ -219,14 +219,14 @@
     <w:p>
       <w:pPr>
         <w:pStyle w:val="ListBullet"/>
-        <w:spacing w:after="20" w:before="0" w:line="240" w:lineRule="auto"/>
+        <w:spacing w:after="40" w:before="0" w:line="254" w:lineRule="auto"/>
       </w:pPr>
       <w:r>
         <w:rPr>
           <w:rFonts w:ascii="Calibri" w:hAnsi="Calibri"/>
           <w:b w:val="0"/>
           <w:i w:val="0"/>
-          <w:sz w:val="19"/>
+          <w:sz w:val="20"/>
         </w:rPr>
         <w:t>Re-architected the sign-up → demo → enrolment funnel: single-step OTP sign-in (replacing a two-step create-then-login flow), a preference-capture ranking model that surfaces best-fit courses during the counselor VC, 6 API-integrated payment gateways with pre-filled links, and auto-cleared parent-approval on payment — reducing drop-off across the sign-up, payment, and enrolment stages.</w:t>
       </w:r>
@@ -234,21 +234,21 @@
     <w:p>
       <w:pPr>
         <w:pStyle w:val="ListBullet"/>
-        <w:spacing w:after="20" w:before="0" w:line="240" w:lineRule="auto"/>
+        <w:spacing w:after="40" w:before="0" w:line="254" w:lineRule="auto"/>
       </w:pPr>
       <w:r>
         <w:rPr>
           <w:rFonts w:ascii="Calibri" w:hAnsi="Calibri"/>
           <w:b w:val="0"/>
           <w:i w:val="0"/>
-          <w:sz w:val="19"/>
+          <w:sz w:val="20"/>
         </w:rPr>
         <w:t>Led the 0→1 launch of the consumer app MVP in 2 months (Feb–Mar 2024: ~1% organic revenue, +10% engagement); built the Student LMS (live classes, feedback reports, PTMs, in-house meeting room), raising course completion 15% and improving NPS.</w:t>
       </w:r>
     </w:p>
     <w:p>
       <w:pPr>
-        <w:spacing w:before="60" w:after="0"/>
+        <w:spacing w:before="70" w:after="0"/>
       </w:pPr>
       <w:r>
         <w:rPr>
@@ -256,7 +256,7 @@
           <w:b/>
           <w:i/>
           <w:color w:val="2E5AAC"/>
-          <w:sz w:val="19"/>
+          <w:sz w:val="20"/>
         </w:rPr>
         <w:t>AI, Design &amp; Automation</w:t>
       </w:r>
@@ -264,14 +264,14 @@
     <w:p>
       <w:pPr>
         <w:pStyle w:val="ListBullet"/>
-        <w:spacing w:after="20" w:before="0" w:line="240" w:lineRule="auto"/>
+        <w:spacing w:after="40" w:before="0" w:line="254" w:lineRule="auto"/>
       </w:pPr>
       <w:r>
         <w:rPr>
           <w:rFonts w:ascii="Calibri" w:hAnsi="Calibri"/>
           <w:b w:val="0"/>
           <w:i w:val="0"/>
-          <w:sz w:val="19"/>
+          <w:sz w:val="20"/>
         </w:rPr>
         <w:t>Designed prototypes and MVP interfaces for the app, LMS, and CRM in Figma, Adobe Express, and Canva AI — using Gemini, Claude, ChatGPT, and Codex to accelerate iteration into clickable flows that aligned engineering and stakeholders before build.</w:t>
       </w:r>
@@ -279,14 +279,14 @@
     <w:p>
       <w:pPr>
         <w:pStyle w:val="ListBullet"/>
-        <w:spacing w:after="20" w:before="0" w:line="240" w:lineRule="auto"/>
+        <w:spacing w:after="40" w:before="0" w:line="254" w:lineRule="auto"/>
       </w:pPr>
       <w:r>
         <w:rPr>
           <w:rFonts w:ascii="Calibri" w:hAnsi="Calibri"/>
           <w:b w:val="0"/>
           <w:i w:val="0"/>
-          <w:sz w:val="19"/>
+          <w:sz w:val="20"/>
         </w:rPr>
         <w:t>Shipped a production GenAI layer (speech/text learning with contextual, age-appropriate responses) and a support chatbot that cut escalations; revamped the Sales CRM (lead navigation, integrated calling, revenue tracking, target-vs-achievement, incentive management), cutting sales-ops workload 80%.</w:t>
       </w:r>
@@ -294,21 +294,21 @@
     <w:p>
       <w:pPr>
         <w:pStyle w:val="ListBullet"/>
-        <w:spacing w:after="20" w:before="0" w:line="240" w:lineRule="auto"/>
+        <w:spacing w:after="40" w:before="0" w:line="254" w:lineRule="auto"/>
       </w:pPr>
       <w:r>
         <w:rPr>
           <w:rFonts w:ascii="Calibri" w:hAnsi="Calibri"/>
           <w:b w:val="0"/>
           <w:i w:val="0"/>
-          <w:sz w:val="19"/>
+          <w:sz w:val="20"/>
         </w:rPr>
         <w:t>Automated incentive flows and enrolment verification (100% coverage), saving ₹1.6L/month and eliminating fake-revenue reporting.</w:t>
       </w:r>
     </w:p>
     <w:p>
       <w:pPr>
-        <w:spacing w:before="100" w:after="40"/>
+        <w:spacing w:before="120" w:after="50"/>
         <w:pBdr>
           <w:bottom w:val="single" w:sz="6" w:space="1" w:color="2E5AAC"/>
         </w:pBdr>
@@ -318,28 +318,28 @@
           <w:rFonts w:ascii="Calibri" w:hAnsi="Calibri"/>
           <w:b/>
           <w:color w:val="1F3864"/>
-          <w:sz w:val="22"/>
+          <w:sz w:val="23"/>
         </w:rPr>
         <w:t>CORE COMPETENCIES</w:t>
       </w:r>
     </w:p>
     <w:p>
       <w:pPr>
-        <w:spacing w:after="20"/>
+        <w:spacing w:after="40"/>
       </w:pPr>
       <w:r>
         <w:rPr>
           <w:rFonts w:ascii="Calibri" w:hAnsi="Calibri"/>
           <w:b w:val="0"/>
           <w:i w:val="0"/>
-          <w:sz w:val="19"/>
+          <w:sz w:val="20"/>
         </w:rPr>
         <w:t>Product Strategy &amp; Roadmapping · Monetization &amp; Unit Economics · Retention &amp; Lifecycle · Funnel &amp; Conversion Optimization · Product Design &amp; Prototyping · A/B Testing &amp; Experimentation · GTM &amp; North-Star Metrics · B2C &amp; Two-Sided Platforms · GenAI Product Development · Stakeholder Management · User Research · Agile/Scrum</w:t>
       </w:r>
     </w:p>
     <w:p>
       <w:pPr>
-        <w:spacing w:before="100" w:after="40"/>
+        <w:spacing w:before="120" w:after="50"/>
         <w:pBdr>
           <w:bottom w:val="single" w:sz="6" w:space="1" w:color="2E5AAC"/>
         </w:pBdr>
@@ -349,7 +349,7 @@
           <w:rFonts w:ascii="Calibri" w:hAnsi="Calibri"/>
           <w:b/>
           <w:color w:val="1F3864"/>
-          <w:sz w:val="22"/>
+          <w:sz w:val="23"/>
         </w:rPr>
         <w:t>TECHNICAL SKILLS &amp; TOOLS</w:t>
       </w:r>
@@ -357,14 +357,14 @@
     <w:p>
       <w:pPr>
         <w:pStyle w:val="ListBullet"/>
-        <w:spacing w:after="20" w:before="0" w:line="240" w:lineRule="auto"/>
+        <w:spacing w:after="40" w:before="0" w:line="254" w:lineRule="auto"/>
       </w:pPr>
       <w:r>
         <w:rPr>
           <w:rFonts w:ascii="Calibri" w:hAnsi="Calibri"/>
           <w:b/>
           <w:i w:val="0"/>
-          <w:sz w:val="19"/>
+          <w:sz w:val="20"/>
         </w:rPr>
         <w:t xml:space="preserve">Data &amp; Analytics: </w:t>
       </w:r>
@@ -373,7 +373,7 @@
           <w:rFonts w:ascii="Calibri" w:hAnsi="Calibri"/>
           <w:b w:val="0"/>
           <w:i w:val="0"/>
-          <w:sz w:val="19"/>
+          <w:sz w:val="20"/>
         </w:rPr>
         <w:t>SQL, GA4, MS Excel (Advanced), Python (basic)</w:t>
       </w:r>
@@ -381,14 +381,14 @@
     <w:p>
       <w:pPr>
         <w:pStyle w:val="ListBullet"/>
-        <w:spacing w:after="20" w:before="0" w:line="240" w:lineRule="auto"/>
+        <w:spacing w:after="40" w:before="0" w:line="254" w:lineRule="auto"/>
       </w:pPr>
       <w:r>
         <w:rPr>
           <w:rFonts w:ascii="Calibri" w:hAnsi="Calibri"/>
           <w:b/>
           <w:i w:val="0"/>
-          <w:sz w:val="19"/>
+          <w:sz w:val="20"/>
         </w:rPr>
         <w:t xml:space="preserve">Design &amp; Prototyping: </w:t>
       </w:r>
@@ -397,7 +397,7 @@
           <w:rFonts w:ascii="Calibri" w:hAnsi="Calibri"/>
           <w:b w:val="0"/>
           <w:i w:val="0"/>
-          <w:sz w:val="19"/>
+          <w:sz w:val="20"/>
         </w:rPr>
         <w:t>Figma, Adobe Express, Canva AI, wireframing, clickable prototypes</w:t>
       </w:r>
@@ -405,14 +405,14 @@
     <w:p>
       <w:pPr>
         <w:pStyle w:val="ListBullet"/>
-        <w:spacing w:after="20" w:before="0" w:line="240" w:lineRule="auto"/>
+        <w:spacing w:after="40" w:before="0" w:line="254" w:lineRule="auto"/>
       </w:pPr>
       <w:r>
         <w:rPr>
           <w:rFonts w:ascii="Calibri" w:hAnsi="Calibri"/>
           <w:b/>
           <w:i w:val="0"/>
-          <w:sz w:val="19"/>
+          <w:sz w:val="20"/>
         </w:rPr>
         <w:t xml:space="preserve">Product &amp; Delivery: </w:t>
       </w:r>
@@ -421,7 +421,7 @@
           <w:rFonts w:ascii="Calibri" w:hAnsi="Calibri"/>
           <w:b w:val="0"/>
           <w:i w:val="0"/>
-          <w:sz w:val="19"/>
+          <w:sz w:val="20"/>
         </w:rPr>
         <w:t>JIRA, Confluence, Agile/Scrum, RICE prioritization</w:t>
       </w:r>
@@ -429,14 +429,14 @@
     <w:p>
       <w:pPr>
         <w:pStyle w:val="ListBullet"/>
-        <w:spacing w:after="20" w:before="0" w:line="240" w:lineRule="auto"/>
+        <w:spacing w:after="40" w:before="0" w:line="254" w:lineRule="auto"/>
       </w:pPr>
       <w:r>
         <w:rPr>
           <w:rFonts w:ascii="Calibri" w:hAnsi="Calibri"/>
           <w:b/>
           <w:i w:val="0"/>
-          <w:sz w:val="19"/>
+          <w:sz w:val="20"/>
         </w:rPr>
         <w:t xml:space="preserve">AI &amp; Integration: </w:t>
       </w:r>
@@ -445,14 +445,14 @@
           <w:rFonts w:ascii="Calibri" w:hAnsi="Calibri"/>
           <w:b w:val="0"/>
           <w:i w:val="0"/>
-          <w:sz w:val="19"/>
+          <w:sz w:val="20"/>
         </w:rPr>
         <w:t>OpenAI / Gemini / Claude APIs, Prompt Engineering, REST APIs, NLP use-cases</w:t>
       </w:r>
     </w:p>
     <w:p>
       <w:pPr>
-        <w:spacing w:before="100" w:after="40"/>
+        <w:spacing w:before="120" w:after="50"/>
         <w:pBdr>
           <w:bottom w:val="single" w:sz="6" w:space="1" w:color="2E5AAC"/>
         </w:pBdr>
@@ -462,7 +462,7 @@
           <w:rFonts w:ascii="Calibri" w:hAnsi="Calibri"/>
           <w:b/>
           <w:color w:val="1F3864"/>
-          <w:sz w:val="22"/>
+          <w:sz w:val="23"/>
         </w:rPr>
         <w:t>EDUCATION</w:t>
       </w:r>
@@ -472,14 +472,14 @@
         <w:tabs>
           <w:tab w:pos="10546" w:val="right"/>
         </w:tabs>
-        <w:spacing w:after="20"/>
+        <w:spacing w:after="40"/>
       </w:pPr>
       <w:r>
         <w:rPr>
           <w:rFonts w:ascii="Calibri" w:hAnsi="Calibri"/>
           <w:b/>
           <w:i w:val="0"/>
-          <w:sz w:val="19"/>
+          <w:sz w:val="20"/>
         </w:rPr>
         <w:t>BBA — Chandigarh University, Chandigarh</w:t>
       </w:r>
@@ -489,7 +489,7 @@
           <w:b w:val="0"/>
           <w:i w:val="0"/>
           <w:color w:val="444444"/>
-          <w:sz w:val="19"/>
+          <w:sz w:val="20"/>
         </w:rPr>
         <w:tab/>
         <w:t>2019 – 2021</w:t>
@@ -500,14 +500,14 @@
         <w:tabs>
           <w:tab w:pos="10546" w:val="right"/>
         </w:tabs>
-        <w:spacing w:after="20"/>
+        <w:spacing w:after="40"/>
       </w:pPr>
       <w:r>
         <w:rPr>
           <w:rFonts w:ascii="Calibri" w:hAnsi="Calibri"/>
           <w:b/>
           <w:i w:val="0"/>
-          <w:sz w:val="19"/>
+          <w:sz w:val="20"/>
         </w:rPr>
         <w:t>Class XII (ISC), St. Thomas High School, Kanpur</w:t>
       </w:r>
@@ -517,7 +517,7 @@
           <w:b w:val="0"/>
           <w:i w:val="0"/>
           <w:color w:val="444444"/>
-          <w:sz w:val="19"/>
+          <w:sz w:val="20"/>
         </w:rPr>
         <w:tab/>
         <w:t>2018</w:t>
@@ -525,7 +525,7 @@
     </w:p>
     <w:p>
       <w:pPr>
-        <w:spacing w:before="100" w:after="40"/>
+        <w:spacing w:before="120" w:after="50"/>
         <w:pBdr>
           <w:bottom w:val="single" w:sz="6" w:space="1" w:color="2E5AAC"/>
         </w:pBdr>
@@ -535,7 +535,7 @@
           <w:rFonts w:ascii="Calibri" w:hAnsi="Calibri"/>
           <w:b/>
           <w:color w:val="1F3864"/>
-          <w:sz w:val="22"/>
+          <w:sz w:val="23"/>
         </w:rPr>
         <w:t>CERTIFICATIONS</w:t>
       </w:r>
@@ -543,14 +543,14 @@
     <w:p>
       <w:pPr>
         <w:pStyle w:val="ListBullet"/>
-        <w:spacing w:after="20" w:before="0" w:line="240" w:lineRule="auto"/>
+        <w:spacing w:after="40" w:before="0" w:line="254" w:lineRule="auto"/>
       </w:pPr>
       <w:r>
         <w:rPr>
           <w:rFonts w:ascii="Calibri" w:hAnsi="Calibri"/>
           <w:b w:val="0"/>
           <w:i w:val="0"/>
-          <w:sz w:val="19"/>
+          <w:sz w:val="20"/>
         </w:rPr>
         <w:t>Product Management Certification — Udemy (2024)    •    JIRA Certification — Udemy (2024)</w:t>
       </w:r>
@@ -929,11 +929,11 @@
     <w:qFormat/>
     <w:rsid w:val="00FC693F"/>
     <w:pPr>
-      <w:spacing w:after="20" w:before="0" w:line="240" w:lineRule="auto"/>
+      <w:spacing w:after="40" w:before="0" w:line="254" w:lineRule="auto"/>
     </w:pPr>
     <w:rPr>
       <w:rFonts w:ascii="Calibri" w:hAnsi="Calibri"/>
-      <w:sz w:val="19"/>
+      <w:sz w:val="20"/>
     </w:rPr>
   </w:style>
   <w:style w:type="paragraph" w:styleId="Header">
@@ -1462,12 +1462,12 @@
       <w:numPr>
         <w:numId w:val="1"/>
       </w:numPr>
-      <w:spacing w:after="20" w:before="0" w:line="240" w:lineRule="auto"/>
+      <w:spacing w:after="40" w:before="0" w:line="254" w:lineRule="auto"/>
       <w:contextualSpacing/>
     </w:pPr>
     <w:rPr>
       <w:rFonts w:ascii="Calibri" w:hAnsi="Calibri"/>
-      <w:sz w:val="19"/>
+      <w:sz w:val="20"/>
     </w:rPr>
   </w:style>
   <w:style w:type="paragraph" w:styleId="ListBullet2">

</xml_diff>

<commit_message>
Revamp master resume: cut B2C repetition, tighten summary, add P&L bullet
Per Kshitiz's review:
- "B2C" reduced from 4 mentions to 1 (kept in the experience intro so ATS still
  matches it) -- 4x was typecasting him as consumer-only and losing B2B/SaaS/
  platform recruiters. Tagline/summary/competencies now use broader-but-truer
  framing (consumer & marketplace platforms).
- Professional Summary cut from 6 lines to 3: positioning only, no longer
  duplicating the metrics already in the bullets.
- Added a differentiated bullet: counselor-wise P&L tracker (only bullet showing
  P&L / unit-economics ownership).
- Tagline broadened to include Funnel, Retention & Payments + Data-Driven.

Auto-fit to one full page (95.2%). Dashboard "My Resume" preview synced.
Conventions recorded in CLAUDE.md so all future tailored resumes follow them.

Co-Authored-By: Claude Opus 4.8 <noreply@anthropic.com>
</commit_message>
<xml_diff>
--- a/resumes/Kshitiz Yadav - Product Manager Resume.docx
+++ b/resumes/Kshitiz Yadav - Product Manager Resume.docx
@@ -13,7 +13,7 @@
           <w:b/>
           <w:i w:val="0"/>
           <w:color w:val="1F3864"/>
-          <w:sz w:val="35"/>
+          <w:sz w:val="34"/>
         </w:rPr>
         <w:t>KSHITIZ YADAV</w:t>
       </w:r>
@@ -29,14 +29,14 @@
           <w:b w:val="0"/>
           <w:i w:val="0"/>
           <w:color w:val="444444"/>
-          <w:sz w:val="20"/>
+          <w:sz w:val="19"/>
         </w:rPr>
-        <w:t>Product Manager  |  B2C Consumer Apps  |  Growth &amp; Monetization  |  Two-Sided Platforms  |  AI-Enabled</w:t>
+        <w:t>Product Manager  |  Growth &amp; Monetization  |  Consumer &amp; Marketplace Platforms  |  Funnel, Retention &amp; Payments  |  Data-Driven, AI-Enabled</w:t>
       </w:r>
     </w:p>
     <w:p>
       <w:pPr>
-        <w:spacing w:after="40"/>
+        <w:spacing w:after="50"/>
         <w:jc w:val="center"/>
       </w:pPr>
       <w:r>
@@ -45,14 +45,14 @@
           <w:b w:val="0"/>
           <w:i w:val="0"/>
           <w:color w:val="444444"/>
-          <w:sz w:val="19"/>
+          <w:sz w:val="18"/>
         </w:rPr>
         <w:t>Gurugram, India  •  +91 8756972501  •  kshitizyadav788@gmail.com  •  linkedin.com/in/kshitizyadav</w:t>
       </w:r>
     </w:p>
     <w:p>
       <w:pPr>
-        <w:spacing w:before="120" w:after="50"/>
+        <w:spacing w:before="130" w:after="50"/>
         <w:pBdr>
           <w:bottom w:val="single" w:sz="6" w:space="1" w:color="2E5AAC"/>
         </w:pBdr>
@@ -62,28 +62,28 @@
           <w:rFonts w:ascii="Calibri" w:hAnsi="Calibri"/>
           <w:b/>
           <w:color w:val="1F3864"/>
-          <w:sz w:val="23"/>
+          <w:sz w:val="22"/>
         </w:rPr>
         <w:t>PROFESSIONAL SUMMARY</w:t>
       </w:r>
     </w:p>
     <w:p>
       <w:pPr>
-        <w:spacing w:after="40"/>
+        <w:spacing w:after="50"/>
       </w:pPr>
       <w:r>
         <w:rPr>
           <w:rFonts w:ascii="Calibri" w:hAnsi="Calibri"/>
           <w:b w:val="0"/>
           <w:i w:val="0"/>
-          <w:sz w:val="20"/>
+          <w:sz w:val="19"/>
         </w:rPr>
-        <w:t>Product Manager with 5+ years owning the full B2C product lifecycle across a consumer app, a two-sided student/teacher LMS, a sales CRM, and a product-led growth &amp; renewal engine at a high-growth EdTech startup. Consistent record of moving core metrics — 20% revenue growth, 25% ARPU expansion, ₹70L in product-led renewals, and 2,000+ organic leads/month at 7% conversion. Pairs monetization and unit-economics thinking with hands-on data analysis (SQL, GA4), A/B testing, and shipping production GenAI features; works across engineering, design, marketing, sales, and operations.</w:t>
+        <w:t>Product Manager with 5+ years owning products end-to-end — from discovery and PRDs through launch, experimentation, and iteration — across consumer apps, a two-sided marketplace, and internal platform and CRM systems. Partners closely with engineering, design, and business teams, using data (SQL, Power BI, GA4) and AI to move core metrics. Track record of driving 20% revenue growth and ₹70L in product-led renewals.</w:t>
       </w:r>
     </w:p>
     <w:p>
       <w:pPr>
-        <w:spacing w:before="120" w:after="50"/>
+        <w:spacing w:before="130" w:after="50"/>
         <w:pBdr>
           <w:bottom w:val="single" w:sz="6" w:space="1" w:color="2E5AAC"/>
         </w:pBdr>
@@ -93,7 +93,7 @@
           <w:rFonts w:ascii="Calibri" w:hAnsi="Calibri"/>
           <w:b/>
           <w:color w:val="1F3864"/>
-          <w:sz w:val="23"/>
+          <w:sz w:val="22"/>
         </w:rPr>
         <w:t>PROFESSIONAL EXPERIENCE</w:t>
       </w:r>
@@ -110,7 +110,7 @@
           <w:rFonts w:ascii="Calibri" w:hAnsi="Calibri"/>
           <w:b/>
           <w:i w:val="0"/>
-          <w:sz w:val="22"/>
+          <w:sz w:val="21"/>
         </w:rPr>
         <w:t>PlanetSpark — Product Manager</w:t>
       </w:r>
@@ -120,7 +120,7 @@
           <w:b w:val="0"/>
           <w:i w:val="0"/>
           <w:color w:val="444444"/>
-          <w:sz w:val="20"/>
+          <w:sz w:val="19"/>
         </w:rPr>
         <w:tab/>
         <w:t>Gurugram · Mar 2021 – Present</w:t>
@@ -128,7 +128,7 @@
     </w:p>
     <w:p>
       <w:pPr>
-        <w:spacing w:after="40"/>
+        <w:spacing w:after="50"/>
       </w:pPr>
       <w:r>
         <w:rPr>
@@ -136,7 +136,7 @@
           <w:b w:val="0"/>
           <w:i/>
           <w:color w:val="333333"/>
-          <w:sz w:val="20"/>
+          <w:sz w:val="19"/>
         </w:rPr>
         <w:t>Own the full product suite of a B2C EdTech marketplace -- one of India's largest public speaking &amp; creative writing platforms, connecting students and teachers via a shared LMS: consumer app, student &amp; teacher LMS, sales CRM, product-led growth &amp; renewal engine, and an in-house AI layer.</w:t>
       </w:r>
@@ -151,7 +151,7 @@
           <w:b/>
           <w:i/>
           <w:color w:val="2E5AAC"/>
-          <w:sz w:val="20"/>
+          <w:sz w:val="19"/>
         </w:rPr>
         <w:t>Growth &amp; Monetization</w:t>
       </w:r>
@@ -159,14 +159,14 @@
     <w:p>
       <w:pPr>
         <w:pStyle w:val="ListBullet"/>
-        <w:spacing w:after="40" w:before="0" w:line="254" w:lineRule="auto"/>
+        <w:spacing w:after="50" w:before="0" w:line="266" w:lineRule="auto"/>
       </w:pPr>
       <w:r>
         <w:rPr>
           <w:rFonts w:ascii="Calibri" w:hAnsi="Calibri"/>
           <w:b w:val="0"/>
           <w:i w:val="0"/>
-          <w:sz w:val="20"/>
+          <w:sz w:val="19"/>
         </w:rPr>
         <w:t>Built the LPP (Learn, Practice, Perform) module — customized 1:1 sessions, group activities, and performance tasks — driving 20% revenue growth, 25% ARPU expansion (₹35K → ₹45K), and 50% higher revenue per class (₹600 → ₹900).</w:t>
       </w:r>
@@ -174,14 +174,14 @@
     <w:p>
       <w:pPr>
         <w:pStyle w:val="ListBullet"/>
-        <w:spacing w:after="40" w:before="0" w:line="254" w:lineRule="auto"/>
+        <w:spacing w:after="50" w:before="0" w:line="266" w:lineRule="auto"/>
       </w:pPr>
       <w:r>
         <w:rPr>
           <w:rFonts w:ascii="Calibri" w:hAnsi="Calibri"/>
           <w:b w:val="0"/>
           <w:i w:val="0"/>
-          <w:sz w:val="20"/>
+          <w:sz w:val="19"/>
         </w:rPr>
         <w:t>Designed an in-product renewal engine (nudges, early-bird access, LMS free-trial classes, teacher-initiated renewals) that lowered sales cost and generated ₹70L in renewals in a single month (Jan 2025).</w:t>
       </w:r>
@@ -189,16 +189,31 @@
     <w:p>
       <w:pPr>
         <w:pStyle w:val="ListBullet"/>
-        <w:spacing w:after="40" w:before="0" w:line="254" w:lineRule="auto"/>
+        <w:spacing w:after="50" w:before="0" w:line="266" w:lineRule="auto"/>
       </w:pPr>
       <w:r>
         <w:rPr>
           <w:rFonts w:ascii="Calibri" w:hAnsi="Calibri"/>
           <w:b w:val="0"/>
           <w:i w:val="0"/>
-          <w:sz w:val="20"/>
+          <w:sz w:val="19"/>
         </w:rPr>
         <w:t>Launched organic acquisition loops surfacing student progress (Sparkline, Word Wisdom, practice classes, workshops) across social channels, bringing 2,000+ organic leads/month at a 7% conversion rate.</w:t>
+      </w:r>
+    </w:p>
+    <w:p>
+      <w:pPr>
+        <w:pStyle w:val="ListBullet"/>
+        <w:spacing w:after="50" w:before="0" w:line="266" w:lineRule="auto"/>
+      </w:pPr>
+      <w:r>
+        <w:rPr>
+          <w:rFonts w:ascii="Calibri" w:hAnsi="Calibri"/>
+          <w:b w:val="0"/>
+          <w:i w:val="0"/>
+          <w:sz w:val="19"/>
+        </w:rPr>
+        <w:t>Built a counselor-wise P&amp;L tracker computing weekly profitability per sales counselor (Net Revenue − Fixed, Refund, Marketing &amp; Sales cost), giving each counselor the revenue figure needed to turn profitable — putting unit-economics visibility in the hands of the front line.</w:t>
       </w:r>
     </w:p>
     <w:p>
@@ -211,7 +226,7 @@
           <w:b/>
           <w:i/>
           <w:color w:val="2E5AAC"/>
-          <w:sz w:val="20"/>
+          <w:sz w:val="19"/>
         </w:rPr>
         <w:t>Funnel &amp; Platform (0→1)</w:t>
       </w:r>
@@ -219,14 +234,14 @@
     <w:p>
       <w:pPr>
         <w:pStyle w:val="ListBullet"/>
-        <w:spacing w:after="40" w:before="0" w:line="254" w:lineRule="auto"/>
+        <w:spacing w:after="50" w:before="0" w:line="266" w:lineRule="auto"/>
       </w:pPr>
       <w:r>
         <w:rPr>
           <w:rFonts w:ascii="Calibri" w:hAnsi="Calibri"/>
           <w:b w:val="0"/>
           <w:i w:val="0"/>
-          <w:sz w:val="20"/>
+          <w:sz w:val="19"/>
         </w:rPr>
         <w:t>Re-architected the sign-up → demo → enrolment funnel: single-step OTP sign-in (replacing a two-step create-then-login flow), a preference-capture ranking model that surfaces best-fit courses during the counselor VC, 6 API-integrated payment gateways with pre-filled links, and auto-cleared parent-approval on payment — reducing drop-off across the sign-up, payment, and enrolment stages.</w:t>
       </w:r>
@@ -234,14 +249,14 @@
     <w:p>
       <w:pPr>
         <w:pStyle w:val="ListBullet"/>
-        <w:spacing w:after="40" w:before="0" w:line="254" w:lineRule="auto"/>
+        <w:spacing w:after="50" w:before="0" w:line="266" w:lineRule="auto"/>
       </w:pPr>
       <w:r>
         <w:rPr>
           <w:rFonts w:ascii="Calibri" w:hAnsi="Calibri"/>
           <w:b w:val="0"/>
           <w:i w:val="0"/>
-          <w:sz w:val="20"/>
+          <w:sz w:val="19"/>
         </w:rPr>
         <w:t>Led the 0→1 launch of the consumer app MVP in 2 months (Feb–Mar 2024: ~1% organic revenue, +10% engagement); built the Student LMS (live classes, feedback reports, PTMs, in-house meeting room), raising course completion 15% and improving NPS.</w:t>
       </w:r>
@@ -256,7 +271,7 @@
           <w:b/>
           <w:i/>
           <w:color w:val="2E5AAC"/>
-          <w:sz w:val="20"/>
+          <w:sz w:val="19"/>
         </w:rPr>
         <w:t>AI, Design &amp; Automation</w:t>
       </w:r>
@@ -264,14 +279,14 @@
     <w:p>
       <w:pPr>
         <w:pStyle w:val="ListBullet"/>
-        <w:spacing w:after="40" w:before="0" w:line="254" w:lineRule="auto"/>
+        <w:spacing w:after="50" w:before="0" w:line="266" w:lineRule="auto"/>
       </w:pPr>
       <w:r>
         <w:rPr>
           <w:rFonts w:ascii="Calibri" w:hAnsi="Calibri"/>
           <w:b w:val="0"/>
           <w:i w:val="0"/>
-          <w:sz w:val="20"/>
+          <w:sz w:val="19"/>
         </w:rPr>
         <w:t>Designed prototypes and MVP interfaces for the app, LMS, and CRM in Figma, Adobe Express, and Canva AI — using Gemini, Claude, ChatGPT, and Codex to accelerate iteration into clickable flows that aligned engineering and stakeholders before build.</w:t>
       </w:r>
@@ -279,14 +294,14 @@
     <w:p>
       <w:pPr>
         <w:pStyle w:val="ListBullet"/>
-        <w:spacing w:after="40" w:before="0" w:line="254" w:lineRule="auto"/>
+        <w:spacing w:after="50" w:before="0" w:line="266" w:lineRule="auto"/>
       </w:pPr>
       <w:r>
         <w:rPr>
           <w:rFonts w:ascii="Calibri" w:hAnsi="Calibri"/>
           <w:b w:val="0"/>
           <w:i w:val="0"/>
-          <w:sz w:val="20"/>
+          <w:sz w:val="19"/>
         </w:rPr>
         <w:t>Shipped a production GenAI layer (speech/text learning with contextual, age-appropriate responses) and a support chatbot that cut escalations; revamped the Sales CRM (lead navigation, integrated calling, revenue tracking, target-vs-achievement, incentive management), cutting sales-ops workload 80%.</w:t>
       </w:r>
@@ -294,21 +309,21 @@
     <w:p>
       <w:pPr>
         <w:pStyle w:val="ListBullet"/>
-        <w:spacing w:after="40" w:before="0" w:line="254" w:lineRule="auto"/>
+        <w:spacing w:after="50" w:before="0" w:line="266" w:lineRule="auto"/>
       </w:pPr>
       <w:r>
         <w:rPr>
           <w:rFonts w:ascii="Calibri" w:hAnsi="Calibri"/>
           <w:b w:val="0"/>
           <w:i w:val="0"/>
-          <w:sz w:val="20"/>
+          <w:sz w:val="19"/>
         </w:rPr>
         <w:t>Automated incentive flows and enrolment verification (100% coverage), saving ₹1.6L/month and eliminating fake-revenue reporting.</w:t>
       </w:r>
     </w:p>
     <w:p>
       <w:pPr>
-        <w:spacing w:before="120" w:after="50"/>
+        <w:spacing w:before="130" w:after="50"/>
         <w:pBdr>
           <w:bottom w:val="single" w:sz="6" w:space="1" w:color="2E5AAC"/>
         </w:pBdr>
@@ -318,28 +333,28 @@
           <w:rFonts w:ascii="Calibri" w:hAnsi="Calibri"/>
           <w:b/>
           <w:color w:val="1F3864"/>
-          <w:sz w:val="23"/>
+          <w:sz w:val="22"/>
         </w:rPr>
         <w:t>CORE COMPETENCIES</w:t>
       </w:r>
     </w:p>
     <w:p>
       <w:pPr>
-        <w:spacing w:after="40"/>
+        <w:spacing w:after="50"/>
       </w:pPr>
       <w:r>
         <w:rPr>
           <w:rFonts w:ascii="Calibri" w:hAnsi="Calibri"/>
           <w:b w:val="0"/>
           <w:i w:val="0"/>
-          <w:sz w:val="20"/>
+          <w:sz w:val="19"/>
         </w:rPr>
-        <w:t>Product Strategy &amp; Roadmapping · Monetization &amp; Unit Economics · Retention &amp; Lifecycle · Funnel &amp; Conversion Optimization · Product Design &amp; Prototyping · A/B Testing &amp; Experimentation · GTM &amp; North-Star Metrics · B2C &amp; Two-Sided Platforms · GenAI Product Development · Stakeholder Management · User Research · Agile/Scrum</w:t>
+        <w:t>Product Strategy &amp; Roadmapping · Monetization &amp; Unit Economics · Retention &amp; Lifecycle · Funnel &amp; Conversion Optimization · Product Design &amp; Prototyping · A/B Testing &amp; Experimentation · GTM &amp; North-Star Metrics · Consumer &amp; Two-Sided Marketplace Platforms · GenAI Product Development · Stakeholder Management · User Research · Agile/Scrum</w:t>
       </w:r>
     </w:p>
     <w:p>
       <w:pPr>
-        <w:spacing w:before="120" w:after="50"/>
+        <w:spacing w:before="130" w:after="50"/>
         <w:pBdr>
           <w:bottom w:val="single" w:sz="6" w:space="1" w:color="2E5AAC"/>
         </w:pBdr>
@@ -349,7 +364,7 @@
           <w:rFonts w:ascii="Calibri" w:hAnsi="Calibri"/>
           <w:b/>
           <w:color w:val="1F3864"/>
-          <w:sz w:val="23"/>
+          <w:sz w:val="22"/>
         </w:rPr>
         <w:t>TECHNICAL SKILLS &amp; TOOLS</w:t>
       </w:r>
@@ -357,14 +372,14 @@
     <w:p>
       <w:pPr>
         <w:pStyle w:val="ListBullet"/>
-        <w:spacing w:after="40" w:before="0" w:line="254" w:lineRule="auto"/>
+        <w:spacing w:after="50" w:before="0" w:line="266" w:lineRule="auto"/>
       </w:pPr>
       <w:r>
         <w:rPr>
           <w:rFonts w:ascii="Calibri" w:hAnsi="Calibri"/>
           <w:b/>
           <w:i w:val="0"/>
-          <w:sz w:val="20"/>
+          <w:sz w:val="19"/>
         </w:rPr>
         <w:t xml:space="preserve">Data &amp; Analytics: </w:t>
       </w:r>
@@ -373,7 +388,7 @@
           <w:rFonts w:ascii="Calibri" w:hAnsi="Calibri"/>
           <w:b w:val="0"/>
           <w:i w:val="0"/>
-          <w:sz w:val="20"/>
+          <w:sz w:val="19"/>
         </w:rPr>
         <w:t>SQL, GA4, MS Excel (Advanced), Python (basic)</w:t>
       </w:r>
@@ -381,14 +396,14 @@
     <w:p>
       <w:pPr>
         <w:pStyle w:val="ListBullet"/>
-        <w:spacing w:after="40" w:before="0" w:line="254" w:lineRule="auto"/>
+        <w:spacing w:after="50" w:before="0" w:line="266" w:lineRule="auto"/>
       </w:pPr>
       <w:r>
         <w:rPr>
           <w:rFonts w:ascii="Calibri" w:hAnsi="Calibri"/>
           <w:b/>
           <w:i w:val="0"/>
-          <w:sz w:val="20"/>
+          <w:sz w:val="19"/>
         </w:rPr>
         <w:t xml:space="preserve">Design &amp; Prototyping: </w:t>
       </w:r>
@@ -397,7 +412,7 @@
           <w:rFonts w:ascii="Calibri" w:hAnsi="Calibri"/>
           <w:b w:val="0"/>
           <w:i w:val="0"/>
-          <w:sz w:val="20"/>
+          <w:sz w:val="19"/>
         </w:rPr>
         <w:t>Figma, Adobe Express, Canva AI, wireframing, clickable prototypes</w:t>
       </w:r>
@@ -405,14 +420,14 @@
     <w:p>
       <w:pPr>
         <w:pStyle w:val="ListBullet"/>
-        <w:spacing w:after="40" w:before="0" w:line="254" w:lineRule="auto"/>
+        <w:spacing w:after="50" w:before="0" w:line="266" w:lineRule="auto"/>
       </w:pPr>
       <w:r>
         <w:rPr>
           <w:rFonts w:ascii="Calibri" w:hAnsi="Calibri"/>
           <w:b/>
           <w:i w:val="0"/>
-          <w:sz w:val="20"/>
+          <w:sz w:val="19"/>
         </w:rPr>
         <w:t xml:space="preserve">Product &amp; Delivery: </w:t>
       </w:r>
@@ -421,7 +436,7 @@
           <w:rFonts w:ascii="Calibri" w:hAnsi="Calibri"/>
           <w:b w:val="0"/>
           <w:i w:val="0"/>
-          <w:sz w:val="20"/>
+          <w:sz w:val="19"/>
         </w:rPr>
         <w:t>JIRA, Confluence, Agile/Scrum, RICE prioritization</w:t>
       </w:r>
@@ -429,14 +444,14 @@
     <w:p>
       <w:pPr>
         <w:pStyle w:val="ListBullet"/>
-        <w:spacing w:after="40" w:before="0" w:line="254" w:lineRule="auto"/>
+        <w:spacing w:after="50" w:before="0" w:line="266" w:lineRule="auto"/>
       </w:pPr>
       <w:r>
         <w:rPr>
           <w:rFonts w:ascii="Calibri" w:hAnsi="Calibri"/>
           <w:b/>
           <w:i w:val="0"/>
-          <w:sz w:val="20"/>
+          <w:sz w:val="19"/>
         </w:rPr>
         <w:t xml:space="preserve">AI &amp; Integration: </w:t>
       </w:r>
@@ -445,14 +460,14 @@
           <w:rFonts w:ascii="Calibri" w:hAnsi="Calibri"/>
           <w:b w:val="0"/>
           <w:i w:val="0"/>
-          <w:sz w:val="20"/>
+          <w:sz w:val="19"/>
         </w:rPr>
         <w:t>OpenAI / Gemini / Claude APIs, Prompt Engineering, REST APIs, NLP use-cases</w:t>
       </w:r>
     </w:p>
     <w:p>
       <w:pPr>
-        <w:spacing w:before="120" w:after="50"/>
+        <w:spacing w:before="130" w:after="50"/>
         <w:pBdr>
           <w:bottom w:val="single" w:sz="6" w:space="1" w:color="2E5AAC"/>
         </w:pBdr>
@@ -462,7 +477,7 @@
           <w:rFonts w:ascii="Calibri" w:hAnsi="Calibri"/>
           <w:b/>
           <w:color w:val="1F3864"/>
-          <w:sz w:val="23"/>
+          <w:sz w:val="22"/>
         </w:rPr>
         <w:t>EDUCATION</w:t>
       </w:r>
@@ -472,14 +487,14 @@
         <w:tabs>
           <w:tab w:pos="10546" w:val="right"/>
         </w:tabs>
-        <w:spacing w:after="40"/>
+        <w:spacing w:after="50"/>
       </w:pPr>
       <w:r>
         <w:rPr>
           <w:rFonts w:ascii="Calibri" w:hAnsi="Calibri"/>
           <w:b/>
           <w:i w:val="0"/>
-          <w:sz w:val="20"/>
+          <w:sz w:val="19"/>
         </w:rPr>
         <w:t>BBA — Chandigarh University, Chandigarh</w:t>
       </w:r>
@@ -489,7 +504,7 @@
           <w:b w:val="0"/>
           <w:i w:val="0"/>
           <w:color w:val="444444"/>
-          <w:sz w:val="20"/>
+          <w:sz w:val="19"/>
         </w:rPr>
         <w:tab/>
         <w:t>2019 – 2021</w:t>
@@ -500,14 +515,14 @@
         <w:tabs>
           <w:tab w:pos="10546" w:val="right"/>
         </w:tabs>
-        <w:spacing w:after="40"/>
+        <w:spacing w:after="50"/>
       </w:pPr>
       <w:r>
         <w:rPr>
           <w:rFonts w:ascii="Calibri" w:hAnsi="Calibri"/>
           <w:b/>
           <w:i w:val="0"/>
-          <w:sz w:val="20"/>
+          <w:sz w:val="19"/>
         </w:rPr>
         <w:t>Class XII (ISC), St. Thomas High School, Kanpur</w:t>
       </w:r>
@@ -517,7 +532,7 @@
           <w:b w:val="0"/>
           <w:i w:val="0"/>
           <w:color w:val="444444"/>
-          <w:sz w:val="20"/>
+          <w:sz w:val="19"/>
         </w:rPr>
         <w:tab/>
         <w:t>2018</w:t>
@@ -525,7 +540,7 @@
     </w:p>
     <w:p>
       <w:pPr>
-        <w:spacing w:before="120" w:after="50"/>
+        <w:spacing w:before="130" w:after="50"/>
         <w:pBdr>
           <w:bottom w:val="single" w:sz="6" w:space="1" w:color="2E5AAC"/>
         </w:pBdr>
@@ -535,7 +550,7 @@
           <w:rFonts w:ascii="Calibri" w:hAnsi="Calibri"/>
           <w:b/>
           <w:color w:val="1F3864"/>
-          <w:sz w:val="23"/>
+          <w:sz w:val="22"/>
         </w:rPr>
         <w:t>CERTIFICATIONS</w:t>
       </w:r>
@@ -543,14 +558,14 @@
     <w:p>
       <w:pPr>
         <w:pStyle w:val="ListBullet"/>
-        <w:spacing w:after="40" w:before="0" w:line="254" w:lineRule="auto"/>
+        <w:spacing w:after="50" w:before="0" w:line="266" w:lineRule="auto"/>
       </w:pPr>
       <w:r>
         <w:rPr>
           <w:rFonts w:ascii="Calibri" w:hAnsi="Calibri"/>
           <w:b w:val="0"/>
           <w:i w:val="0"/>
-          <w:sz w:val="20"/>
+          <w:sz w:val="19"/>
         </w:rPr>
         <w:t>Product Management Certification — Udemy (2024)    •    JIRA Certification — Udemy (2024)</w:t>
       </w:r>
@@ -929,11 +944,11 @@
     <w:qFormat/>
     <w:rsid w:val="00FC693F"/>
     <w:pPr>
-      <w:spacing w:after="40" w:before="0" w:line="254" w:lineRule="auto"/>
+      <w:spacing w:after="50" w:before="0" w:line="266" w:lineRule="auto"/>
     </w:pPr>
     <w:rPr>
       <w:rFonts w:ascii="Calibri" w:hAnsi="Calibri"/>
-      <w:sz w:val="20"/>
+      <w:sz w:val="19"/>
     </w:rPr>
   </w:style>
   <w:style w:type="paragraph" w:styleId="Header">
@@ -1462,12 +1477,12 @@
       <w:numPr>
         <w:numId w:val="1"/>
       </w:numPr>
-      <w:spacing w:after="40" w:before="0" w:line="254" w:lineRule="auto"/>
+      <w:spacing w:after="50" w:before="0" w:line="266" w:lineRule="auto"/>
       <w:contextualSpacing/>
     </w:pPr>
     <w:rPr>
       <w:rFonts w:ascii="Calibri" w:hAnsi="Calibri"/>
-      <w:sz w:val="20"/>
+      <w:sz w:val="19"/>
     </w:rPr>
   </w:style>
   <w:style w:type="paragraph" w:styleId="ListBullet2">

</xml_diff>

<commit_message>
Restructure base resume to real 3-role progression; align dashboard + portfolio
Base resume (build_resume.py) rebuilt: Sr Product Analyst -> APM -> PM as dated
sub-entries, honest metrics strip, Core Competencies moved below summary, clickable
email/LinkedIn, Pricing & Packaging competency (pricing ownership confirmed),
de-EdTech'd growth/monetization/payments positioning. New verified numbers added to
base + experience_bank.md: CSAT (5/5) 10%->25%, teacher NPS -20->+40, RAG chatbot
FRT 4min->10s & escalations ~300->50, advisor P&L 50->100->125, 150K enrolled/30K DAU,
squad of 8 eng + 2 QA, ships features via Claude Code. keyword_coverage_score() updated
for new roles shape. index.html resumeDoc + renderResumeDoc + analysis and portfolio.html
updated to match (verified numbers, advisor wording, BBA 2018-2021, progression axis).
Existing tailored resumes NOT yet migrated to new template (tracked in PROJECT_LOG).

Co-Authored-By: Claude Opus 4.8 <noreply@anthropic.com>
</commit_message>
<xml_diff>
--- a/resumes/Kshitiz Yadav - Product Manager Resume.docx
+++ b/resumes/Kshitiz Yadav - Product Manager Resume.docx
@@ -31,12 +31,12 @@
           <w:color w:val="444444"/>
           <w:sz w:val="19"/>
         </w:rPr>
-        <w:t>Product Manager  |  Growth &amp; Monetization  |  Consumer &amp; Marketplace Platforms  |  Funnel, Retention &amp; Payments  |  Data-Driven, AI-Enabled</w:t>
+        <w:t>Product Manager  |  Growth, Monetization &amp; Payments  |  Consumer, Marketplace &amp; Platform Products  |  SQL, Analytics &amp; APIs</w:t>
       </w:r>
     </w:p>
     <w:p>
       <w:pPr>
-        <w:spacing w:after="50"/>
+        <w:spacing w:after="20"/>
         <w:jc w:val="center"/>
       </w:pPr>
       <w:r>
@@ -47,12 +47,58 @@
           <w:color w:val="444444"/>
           <w:sz w:val="18"/>
         </w:rPr>
-        <w:t>Gurugram, India  •  +91 8756972501  •  kshitizyadav788@gmail.com  •  linkedin.com/in/kshitizyadav</w:t>
+        <w:t xml:space="preserve">Gurugram, India  •  +91 8756972501  •  </w:t>
+      </w:r>
+      <w:hyperlink r:id="rId9">
+        <w:r>
+          <w:rPr>
+            <w:rFonts w:ascii="Calibri" w:hAnsi="Calibri"/>
+            <w:color w:val="444444"/>
+            <w:sz w:val="18"/>
+          </w:rPr>
+          <w:t xml:space="preserve">kshitizyadav788@gmail.com</w:t>
+        </w:r>
+      </w:hyperlink>
+      <w:r>
+        <w:rPr>
+          <w:rFonts w:ascii="Calibri" w:hAnsi="Calibri"/>
+          <w:b w:val="0"/>
+          <w:i w:val="0"/>
+          <w:color w:val="444444"/>
+          <w:sz w:val="18"/>
+        </w:rPr>
+        <w:t xml:space="preserve">  •  </w:t>
+      </w:r>
+      <w:hyperlink r:id="rId10">
+        <w:r>
+          <w:rPr>
+            <w:rFonts w:ascii="Calibri" w:hAnsi="Calibri"/>
+            <w:color w:val="444444"/>
+            <w:sz w:val="18"/>
+          </w:rPr>
+          <w:t xml:space="preserve">linkedin.com/in/kshitizyadav</w:t>
+        </w:r>
+      </w:hyperlink>
+    </w:p>
+    <w:p>
+      <w:pPr>
+        <w:spacing w:after="40"/>
+        <w:jc w:val="center"/>
+      </w:pPr>
+      <w:r>
+        <w:rPr>
+          <w:rFonts w:ascii="Calibri" w:hAnsi="Calibri"/>
+          <w:b/>
+          <w:i w:val="0"/>
+          <w:color w:val="2E5AAC"/>
+          <w:sz w:val="18"/>
+        </w:rPr>
+        <w:t>20% Revenue Growth   •   25% ARPU Expansion (₹35K → ₹45K)   •   ₹70L Renewals in a Single Month   •   80% Lower Ops Workload</w:t>
       </w:r>
     </w:p>
     <w:p>
       <w:pPr>
-        <w:spacing w:before="130" w:after="50"/>
+        <w:spacing w:before="120" w:after="50"/>
         <w:pBdr>
           <w:bottom w:val="single" w:sz="6" w:space="1" w:color="2E5AAC"/>
         </w:pBdr>
@@ -69,7 +115,7 @@
     </w:p>
     <w:p>
       <w:pPr>
-        <w:spacing w:after="50"/>
+        <w:spacing w:after="40"/>
       </w:pPr>
       <w:r>
         <w:rPr>
@@ -78,12 +124,43 @@
           <w:i w:val="0"/>
           <w:sz w:val="19"/>
         </w:rPr>
-        <w:t>Product Manager with 5+ years owning products end-to-end — from discovery and PRDs through launch, experimentation, and iteration — across consumer apps, a two-sided marketplace, and internal platform and CRM systems. Partners closely with engineering, design, and business teams, using data (SQL, Power BI, GA4) and AI to move core metrics. Track record of driving 20% revenue growth and ₹70L in product-led renewals.</w:t>
+        <w:t>Product Manager with 5+ years of product experience building growth, monetization, payments, and workflow-automation products across consumer apps, a two-sided marketplace, CRM, and internal platforms serving 150,000+ enrolled users. Progressed from Senior Product Analyst to Assistant Product Manager to Product Manager — owning discovery, PRDs, prioritization, launch, and iteration with engineering, design, and business teams. Delivered 20% revenue growth, 25% ARPU expansion, ₹70L in product-led renewals in a single month, and 80% lower operational workload, using SQL, Power BI, and AI as force-multipliers.</w:t>
       </w:r>
     </w:p>
     <w:p>
       <w:pPr>
-        <w:spacing w:before="130" w:after="50"/>
+        <w:spacing w:before="120" w:after="50"/>
+        <w:pBdr>
+          <w:bottom w:val="single" w:sz="6" w:space="1" w:color="2E5AAC"/>
+        </w:pBdr>
+      </w:pPr>
+      <w:r>
+        <w:rPr>
+          <w:rFonts w:ascii="Calibri" w:hAnsi="Calibri"/>
+          <w:b/>
+          <w:color w:val="1F3864"/>
+          <w:sz w:val="22"/>
+        </w:rPr>
+        <w:t>CORE COMPETENCIES</w:t>
+      </w:r>
+    </w:p>
+    <w:p>
+      <w:pPr>
+        <w:spacing w:after="40"/>
+      </w:pPr>
+      <w:r>
+        <w:rPr>
+          <w:rFonts w:ascii="Calibri" w:hAnsi="Calibri"/>
+          <w:b w:val="0"/>
+          <w:i w:val="0"/>
+          <w:sz w:val="19"/>
+        </w:rPr>
+        <w:t>Product Strategy &amp; Roadmapping · Product Discovery &amp; User Research · PRDs &amp; Prioritization · Growth &amp; Monetization · Pricing &amp; Packaging · Retention &amp; Lifecycle · Funnel &amp; Conversion Optimization · Payments &amp; API Integrations · Workflow Automation · Product Analytics &amp; Insights · GTM &amp; Product Launch · Marketplace &amp; Platform Products · Unit Economics · Cross-Functional Leadership</w:t>
+      </w:r>
+    </w:p>
+    <w:p>
+      <w:pPr>
+        <w:spacing w:before="120" w:after="50"/>
         <w:pBdr>
           <w:bottom w:val="single" w:sz="6" w:space="1" w:color="2E5AAC"/>
         </w:pBdr>
@@ -100,9 +177,6 @@
     </w:p>
     <w:p>
       <w:pPr>
-        <w:tabs>
-          <w:tab w:pos="10546" w:val="right"/>
-        </w:tabs>
         <w:spacing w:after="0"/>
       </w:pPr>
       <w:r>
@@ -112,23 +186,12 @@
           <w:i w:val="0"/>
           <w:sz w:val="21"/>
         </w:rPr>
-        <w:t>PlanetSpark — Product Manager</w:t>
-      </w:r>
-      <w:r>
-        <w:rPr>
-          <w:rFonts w:ascii="Calibri" w:hAnsi="Calibri"/>
-          <w:b w:val="0"/>
-          <w:i w:val="0"/>
-          <w:color w:val="444444"/>
-          <w:sz w:val="19"/>
-        </w:rPr>
-        <w:tab/>
-        <w:t>Gurugram · Mar 2021 – Present</w:t>
+        <w:t>PlanetSpark — Gurugram</w:t>
       </w:r>
     </w:p>
     <w:p>
       <w:pPr>
-        <w:spacing w:after="50"/>
+        <w:spacing w:after="40"/>
       </w:pPr>
       <w:r>
         <w:rPr>
@@ -138,11 +201,14 @@
           <w:color w:val="333333"/>
           <w:sz w:val="19"/>
         </w:rPr>
-        <w:t>Own the full product suite of a B2C EdTech marketplace -- one of India's largest public speaking &amp; creative writing platforms, connecting students and teachers via a shared LMS: consumer app, student &amp; teacher LMS, sales CRM, product-led growth &amp; renewal engine, and an in-house AI layer.</w:t>
+        <w:t>A B2C subscription marketplace (EdTech) connecting 150,000+ enrolled users with teachers via a shared LMS — spanning consumer app, two-sided platform, payments, CRM, renewals, and lifecycle products, with 30,000+ daily active users. Progressed across three roles while owning an expanding product surface.</w:t>
       </w:r>
     </w:p>
     <w:p>
       <w:pPr>
+        <w:tabs>
+          <w:tab w:pos="10546" w:val="right"/>
+        </w:tabs>
         <w:spacing w:before="70" w:after="0"/>
       </w:pPr>
       <w:r>
@@ -153,13 +219,158 @@
           <w:color w:val="2E5AAC"/>
           <w:sz w:val="19"/>
         </w:rPr>
-        <w:t>Growth &amp; Monetization</w:t>
+        <w:t>Product Manager</w:t>
+      </w:r>
+      <w:r>
+        <w:rPr>
+          <w:rFonts w:ascii="Calibri" w:hAnsi="Calibri"/>
+          <w:b w:val="0"/>
+          <w:i/>
+          <w:color w:val="444444"/>
+          <w:sz w:val="19"/>
+        </w:rPr>
+        <w:tab/>
+        <w:t>Sep 2023 – Present</w:t>
       </w:r>
     </w:p>
     <w:p>
       <w:pPr>
         <w:pStyle w:val="ListBullet"/>
-        <w:spacing w:after="50" w:before="0" w:line="266" w:lineRule="auto"/>
+        <w:spacing w:after="40" w:before="0" w:line="254" w:lineRule="auto"/>
+      </w:pPr>
+      <w:r>
+        <w:rPr>
+          <w:rFonts w:ascii="Calibri" w:hAnsi="Calibri"/>
+          <w:b w:val="0"/>
+          <w:i w:val="0"/>
+          <w:sz w:val="19"/>
+        </w:rPr>
+        <w:t>Own the full product suite — consumer app, student &amp; teacher LMS, advisor CRM, renewal engine, and in-house AI layer — for a platform with 150,000+ enrolled users and 30,000+ daily active users, leading a cross-functional squad of 8 engineers and 2 QA from discovery to launch.</w:t>
+      </w:r>
+    </w:p>
+    <w:p>
+      <w:pPr>
+        <w:pStyle w:val="ListBullet"/>
+        <w:spacing w:after="40" w:before="0" w:line="254" w:lineRule="auto"/>
+      </w:pPr>
+      <w:r>
+        <w:rPr>
+          <w:rFonts w:ascii="Calibri" w:hAnsi="Calibri"/>
+          <w:b w:val="0"/>
+          <w:i w:val="0"/>
+          <w:sz w:val="19"/>
+        </w:rPr>
+        <w:t>Designed an in-product renewal engine (nudges, early-bird access, LMS free-trial classes, teacher-initiated renewals) that reduced assisted-renewal cost and generated ₹70L in product-led renewals in a single month (Jan 2025).</w:t>
+      </w:r>
+    </w:p>
+    <w:p>
+      <w:pPr>
+        <w:pStyle w:val="ListBullet"/>
+        <w:spacing w:after="40" w:before="0" w:line="254" w:lineRule="auto"/>
+      </w:pPr>
+      <w:r>
+        <w:rPr>
+          <w:rFonts w:ascii="Calibri" w:hAnsi="Calibri"/>
+          <w:b w:val="0"/>
+          <w:i w:val="0"/>
+          <w:sz w:val="19"/>
+        </w:rPr>
+        <w:t>Increased the share of enrolled users rating the product 5 out of 5 from 10% to 25% via onboarding and retention work: seamless onboarding, teacher PTMs and feedback, a one-page student-detail UI, a loyalty program, and the PSpark in-app wallet.</w:t>
+      </w:r>
+    </w:p>
+    <w:p>
+      <w:pPr>
+        <w:pStyle w:val="ListBullet"/>
+        <w:spacing w:after="40" w:before="0" w:line="254" w:lineRule="auto"/>
+      </w:pPr>
+      <w:r>
+        <w:rPr>
+          <w:rFonts w:ascii="Calibri" w:hAnsi="Calibri"/>
+          <w:b w:val="0"/>
+          <w:i w:val="0"/>
+          <w:sz w:val="19"/>
+        </w:rPr>
+        <w:t>Re-architected the sign-up → demo → enrolment funnel — single-step OTP, a preference-capture ranking model, and 6 API-integrated payment gateways with pre-filled links and auto-cleared approvals — enabling self-serve, plan-based purchase with no manual intervention.</w:t>
+      </w:r>
+    </w:p>
+    <w:p>
+      <w:pPr>
+        <w:pStyle w:val="ListBullet"/>
+        <w:spacing w:after="40" w:before="0" w:line="254" w:lineRule="auto"/>
+      </w:pPr>
+      <w:r>
+        <w:rPr>
+          <w:rFonts w:ascii="Calibri" w:hAnsi="Calibri"/>
+          <w:b w:val="0"/>
+          <w:i w:val="0"/>
+          <w:sz w:val="19"/>
+        </w:rPr>
+        <w:t>Built an advisor-wise P&amp;L tracker (weekly Net Revenue − Fixed, Refund, Marketing &amp; Sales cost) whose visibility drove profitability interventions — profitable advisors rose from 50 to 100 in one month and to 125 over the next two.</w:t>
+      </w:r>
+    </w:p>
+    <w:p>
+      <w:pPr>
+        <w:pStyle w:val="ListBullet"/>
+        <w:spacing w:after="40" w:before="0" w:line="254" w:lineRule="auto"/>
+      </w:pPr>
+      <w:r>
+        <w:rPr>
+          <w:rFonts w:ascii="Calibri" w:hAnsi="Calibri"/>
+          <w:b w:val="0"/>
+          <w:i w:val="0"/>
+          <w:sz w:val="19"/>
+        </w:rPr>
+        <w:t>Shipped a production GenAI learning layer (age-appropriate speech/text responses) and a RAG-based support chatbot — cutting first-response time from 4 minutes to under 10 seconds and monthly escalations from ~300 to under 50 within three months.</w:t>
+      </w:r>
+    </w:p>
+    <w:p>
+      <w:pPr>
+        <w:pStyle w:val="ListBullet"/>
+        <w:spacing w:after="40" w:before="0" w:line="254" w:lineRule="auto"/>
+      </w:pPr>
+      <w:r>
+        <w:rPr>
+          <w:rFonts w:ascii="Calibri" w:hAnsi="Calibri"/>
+          <w:b w:val="0"/>
+          <w:i w:val="0"/>
+          <w:sz w:val="19"/>
+        </w:rPr>
+        <w:t>Ship minor and mid-level product features using AI-assisted development (Claude Code) — scoping, implementing, and testing changes, and raising merge requests for engineering review.</w:t>
+      </w:r>
+    </w:p>
+    <w:p>
+      <w:pPr>
+        <w:tabs>
+          <w:tab w:pos="10546" w:val="right"/>
+        </w:tabs>
+        <w:spacing w:before="70" w:after="0"/>
+      </w:pPr>
+      <w:r>
+        <w:rPr>
+          <w:rFonts w:ascii="Calibri" w:hAnsi="Calibri"/>
+          <w:b/>
+          <w:i/>
+          <w:color w:val="2E5AAC"/>
+          <w:sz w:val="19"/>
+        </w:rPr>
+        <w:t>Assistant Product Manager</w:t>
+      </w:r>
+      <w:r>
+        <w:rPr>
+          <w:rFonts w:ascii="Calibri" w:hAnsi="Calibri"/>
+          <w:b w:val="0"/>
+          <w:i/>
+          <w:color w:val="444444"/>
+          <w:sz w:val="19"/>
+        </w:rPr>
+        <w:tab/>
+        <w:t>Sep 2022 – Aug 2023</w:t>
+      </w:r>
+    </w:p>
+    <w:p>
+      <w:pPr>
+        <w:pStyle w:val="ListBullet"/>
+        <w:spacing w:after="40" w:before="0" w:line="254" w:lineRule="auto"/>
       </w:pPr>
       <w:r>
         <w:rPr>
@@ -174,7 +385,7 @@
     <w:p>
       <w:pPr>
         <w:pStyle w:val="ListBullet"/>
-        <w:spacing w:after="50" w:before="0" w:line="266" w:lineRule="auto"/>
+        <w:spacing w:after="40" w:before="0" w:line="254" w:lineRule="auto"/>
       </w:pPr>
       <w:r>
         <w:rPr>
@@ -183,13 +394,28 @@
           <w:i w:val="0"/>
           <w:sz w:val="19"/>
         </w:rPr>
-        <w:t>Designed an in-product renewal engine (nudges, early-bird access, LMS free-trial classes, teacher-initiated renewals) that lowered sales cost and generated ₹70L in renewals in a single month (Jan 2025).</w:t>
+        <w:t>Rebuilt the teacher LMS with real-time payout automation, accurate payout summaries, and consolidated CRM and class details — lifting teacher NPS from −20 to +40.</w:t>
       </w:r>
     </w:p>
     <w:p>
       <w:pPr>
         <w:pStyle w:val="ListBullet"/>
-        <w:spacing w:after="50" w:before="0" w:line="266" w:lineRule="auto"/>
+        <w:spacing w:after="40" w:before="0" w:line="254" w:lineRule="auto"/>
+      </w:pPr>
+      <w:r>
+        <w:rPr>
+          <w:rFonts w:ascii="Calibri" w:hAnsi="Calibri"/>
+          <w:b w:val="0"/>
+          <w:i w:val="0"/>
+          <w:sz w:val="19"/>
+        </w:rPr>
+        <w:t>Automated enrolment verification and incentive flows to 100% coverage and revamped the advisor CRM (lead navigation, calling, revenue &amp; target tracking) — cutting operations workload 80% and saving ₹1.6L/month.</w:t>
+      </w:r>
+    </w:p>
+    <w:p>
+      <w:pPr>
+        <w:pStyle w:val="ListBullet"/>
+        <w:spacing w:after="40" w:before="0" w:line="254" w:lineRule="auto"/>
       </w:pPr>
       <w:r>
         <w:rPr>
@@ -203,21 +429,9 @@
     </w:p>
     <w:p>
       <w:pPr>
-        <w:pStyle w:val="ListBullet"/>
-        <w:spacing w:after="50" w:before="0" w:line="266" w:lineRule="auto"/>
-      </w:pPr>
-      <w:r>
-        <w:rPr>
-          <w:rFonts w:ascii="Calibri" w:hAnsi="Calibri"/>
-          <w:b w:val="0"/>
-          <w:i w:val="0"/>
-          <w:sz w:val="19"/>
-        </w:rPr>
-        <w:t>Built a counselor-wise P&amp;L tracker computing weekly profitability per sales counselor (Net Revenue − Fixed, Refund, Marketing &amp; Sales cost), giving each counselor the revenue figure needed to turn profitable — putting unit-economics visibility in the hands of the front line.</w:t>
-      </w:r>
-    </w:p>
-    <w:p>
-      <w:pPr>
+        <w:tabs>
+          <w:tab w:pos="10546" w:val="right"/>
+        </w:tabs>
         <w:spacing w:before="70" w:after="0"/>
       </w:pPr>
       <w:r>
@@ -228,13 +442,24 @@
           <w:color w:val="2E5AAC"/>
           <w:sz w:val="19"/>
         </w:rPr>
-        <w:t>Funnel &amp; Platform (0→1)</w:t>
+        <w:t>Senior Product Analyst</w:t>
+      </w:r>
+      <w:r>
+        <w:rPr>
+          <w:rFonts w:ascii="Calibri" w:hAnsi="Calibri"/>
+          <w:b w:val="0"/>
+          <w:i/>
+          <w:color w:val="444444"/>
+          <w:sz w:val="19"/>
+        </w:rPr>
+        <w:tab/>
+        <w:t>Mar 2021 – Aug 2022</w:t>
       </w:r>
     </w:p>
     <w:p>
       <w:pPr>
         <w:pStyle w:val="ListBullet"/>
-        <w:spacing w:after="50" w:before="0" w:line="266" w:lineRule="auto"/>
+        <w:spacing w:after="40" w:before="0" w:line="254" w:lineRule="auto"/>
       </w:pPr>
       <w:r>
         <w:rPr>
@@ -243,13 +468,13 @@
           <w:i w:val="0"/>
           <w:sz w:val="19"/>
         </w:rPr>
-        <w:t>Re-architected the sign-up → demo → enrolment funnel: single-step OTP sign-in (replacing a two-step create-then-login flow), a preference-capture ranking model that surfaces best-fit courses during the counselor VC, 6 API-integrated payment gateways with pre-filled links, and auto-cleared parent-approval on payment — reducing drop-off across the sign-up, payment, and enrolment stages.</w:t>
+        <w:t>Developed SQL and Power BI reporting across growth, revenue, and operations; improved weekly revenue accuracy and created a data foundation for product and commercial decisions.</w:t>
       </w:r>
     </w:p>
     <w:p>
       <w:pPr>
         <w:pStyle w:val="ListBullet"/>
-        <w:spacing w:after="50" w:before="0" w:line="266" w:lineRule="auto"/>
+        <w:spacing w:after="40" w:before="0" w:line="254" w:lineRule="auto"/>
       </w:pPr>
       <w:r>
         <w:rPr>
@@ -258,103 +483,12 @@
           <w:i w:val="0"/>
           <w:sz w:val="19"/>
         </w:rPr>
-        <w:t>Led the 0→1 launch of the consumer app MVP in 2 months (Feb–Mar 2024: ~1% organic revenue, +10% engagement); built the Student LMS (live classes, feedback reports, PTMs, in-house meeting room), raising course completion 15% and improving NPS.</w:t>
+        <w:t>Implemented customer-verification controls that reduced invalid or fraudulent transactions from 10% to 1% while minimizing manual intervention.</w:t>
       </w:r>
     </w:p>
     <w:p>
       <w:pPr>
-        <w:spacing w:before="70" w:after="0"/>
-      </w:pPr>
-      <w:r>
-        <w:rPr>
-          <w:rFonts w:ascii="Calibri" w:hAnsi="Calibri"/>
-          <w:b/>
-          <w:i/>
-          <w:color w:val="2E5AAC"/>
-          <w:sz w:val="19"/>
-        </w:rPr>
-        <w:t>AI, Design &amp; Automation</w:t>
-      </w:r>
-    </w:p>
-    <w:p>
-      <w:pPr>
-        <w:pStyle w:val="ListBullet"/>
-        <w:spacing w:after="50" w:before="0" w:line="266" w:lineRule="auto"/>
-      </w:pPr>
-      <w:r>
-        <w:rPr>
-          <w:rFonts w:ascii="Calibri" w:hAnsi="Calibri"/>
-          <w:b w:val="0"/>
-          <w:i w:val="0"/>
-          <w:sz w:val="19"/>
-        </w:rPr>
-        <w:t>Designed prototypes and MVP interfaces for the app, LMS, and CRM in Figma, Adobe Express, and Canva AI — using Gemini, Claude, ChatGPT, and Codex to accelerate iteration into clickable flows that aligned engineering and stakeholders before build.</w:t>
-      </w:r>
-    </w:p>
-    <w:p>
-      <w:pPr>
-        <w:pStyle w:val="ListBullet"/>
-        <w:spacing w:after="50" w:before="0" w:line="266" w:lineRule="auto"/>
-      </w:pPr>
-      <w:r>
-        <w:rPr>
-          <w:rFonts w:ascii="Calibri" w:hAnsi="Calibri"/>
-          <w:b w:val="0"/>
-          <w:i w:val="0"/>
-          <w:sz w:val="19"/>
-        </w:rPr>
-        <w:t>Shipped a production GenAI layer (speech/text learning with contextual, age-appropriate responses) and a support chatbot that cut escalations; revamped the Sales CRM (lead navigation, integrated calling, revenue tracking, target-vs-achievement, incentive management), cutting sales-ops workload 80%.</w:t>
-      </w:r>
-    </w:p>
-    <w:p>
-      <w:pPr>
-        <w:pStyle w:val="ListBullet"/>
-        <w:spacing w:after="50" w:before="0" w:line="266" w:lineRule="auto"/>
-      </w:pPr>
-      <w:r>
-        <w:rPr>
-          <w:rFonts w:ascii="Calibri" w:hAnsi="Calibri"/>
-          <w:b w:val="0"/>
-          <w:i w:val="0"/>
-          <w:sz w:val="19"/>
-        </w:rPr>
-        <w:t>Automated incentive flows and enrolment verification (100% coverage), saving ₹1.6L/month and eliminating fake-revenue reporting.</w:t>
-      </w:r>
-    </w:p>
-    <w:p>
-      <w:pPr>
-        <w:spacing w:before="130" w:after="50"/>
-        <w:pBdr>
-          <w:bottom w:val="single" w:sz="6" w:space="1" w:color="2E5AAC"/>
-        </w:pBdr>
-      </w:pPr>
-      <w:r>
-        <w:rPr>
-          <w:rFonts w:ascii="Calibri" w:hAnsi="Calibri"/>
-          <w:b/>
-          <w:color w:val="1F3864"/>
-          <w:sz w:val="22"/>
-        </w:rPr>
-        <w:t>CORE COMPETENCIES</w:t>
-      </w:r>
-    </w:p>
-    <w:p>
-      <w:pPr>
-        <w:spacing w:after="50"/>
-      </w:pPr>
-      <w:r>
-        <w:rPr>
-          <w:rFonts w:ascii="Calibri" w:hAnsi="Calibri"/>
-          <w:b w:val="0"/>
-          <w:i w:val="0"/>
-          <w:sz w:val="19"/>
-        </w:rPr>
-        <w:t>Product Strategy &amp; Roadmapping · Monetization &amp; Unit Economics · Retention &amp; Lifecycle · Funnel &amp; Conversion Optimization · Product Design &amp; Prototyping · A/B Testing &amp; Experimentation · GTM &amp; North-Star Metrics · Consumer &amp; Two-Sided Marketplace Platforms · GenAI Product Development · Stakeholder Management · User Research · Agile/Scrum</w:t>
-      </w:r>
-    </w:p>
-    <w:p>
-      <w:pPr>
-        <w:spacing w:before="130" w:after="50"/>
+        <w:spacing w:before="120" w:after="50"/>
         <w:pBdr>
           <w:bottom w:val="single" w:sz="6" w:space="1" w:color="2E5AAC"/>
         </w:pBdr>
@@ -372,7 +506,7 @@
     <w:p>
       <w:pPr>
         <w:pStyle w:val="ListBullet"/>
-        <w:spacing w:after="50" w:before="0" w:line="266" w:lineRule="auto"/>
+        <w:spacing w:after="40" w:before="0" w:line="254" w:lineRule="auto"/>
       </w:pPr>
       <w:r>
         <w:rPr>
@@ -390,37 +524,13 @@
           <w:i w:val="0"/>
           <w:sz w:val="19"/>
         </w:rPr>
-        <w:t>SQL, GA4, MS Excel (Advanced), Python (basic)</w:t>
+        <w:t>SQL, GA4, Power BI, MS Excel (Advanced), Python (basic)</w:t>
       </w:r>
     </w:p>
     <w:p>
       <w:pPr>
         <w:pStyle w:val="ListBullet"/>
-        <w:spacing w:after="50" w:before="0" w:line="266" w:lineRule="auto"/>
-      </w:pPr>
-      <w:r>
-        <w:rPr>
-          <w:rFonts w:ascii="Calibri" w:hAnsi="Calibri"/>
-          <w:b/>
-          <w:i w:val="0"/>
-          <w:sz w:val="19"/>
-        </w:rPr>
-        <w:t xml:space="preserve">Design &amp; Prototyping: </w:t>
-      </w:r>
-      <w:r>
-        <w:rPr>
-          <w:rFonts w:ascii="Calibri" w:hAnsi="Calibri"/>
-          <w:b w:val="0"/>
-          <w:i w:val="0"/>
-          <w:sz w:val="19"/>
-        </w:rPr>
-        <w:t>Figma, Adobe Express, Canva AI, wireframing, clickable prototypes</w:t>
-      </w:r>
-    </w:p>
-    <w:p>
-      <w:pPr>
-        <w:pStyle w:val="ListBullet"/>
-        <w:spacing w:after="50" w:before="0" w:line="266" w:lineRule="auto"/>
+        <w:spacing w:after="40" w:before="0" w:line="254" w:lineRule="auto"/>
       </w:pPr>
       <w:r>
         <w:rPr>
@@ -438,13 +548,13 @@
           <w:i w:val="0"/>
           <w:sz w:val="19"/>
         </w:rPr>
-        <w:t>JIRA, Confluence, Agile/Scrum, RICE prioritization</w:t>
+        <w:t>JIRA, Confluence, Agile/Scrum, RICE prioritization, Figma</w:t>
       </w:r>
     </w:p>
     <w:p>
       <w:pPr>
         <w:pStyle w:val="ListBullet"/>
-        <w:spacing w:after="50" w:before="0" w:line="266" w:lineRule="auto"/>
+        <w:spacing w:after="40" w:before="0" w:line="254" w:lineRule="auto"/>
       </w:pPr>
       <w:r>
         <w:rPr>
@@ -462,12 +572,12 @@
           <w:i w:val="0"/>
           <w:sz w:val="19"/>
         </w:rPr>
-        <w:t>OpenAI / Gemini / Claude APIs, Prompt Engineering, REST APIs, NLP use-cases</w:t>
+        <w:t>OpenAI / Gemini / Claude APIs, Claude Code, Prompt Engineering, RAG, REST APIs, Payment Integrations</w:t>
       </w:r>
     </w:p>
     <w:p>
       <w:pPr>
-        <w:spacing w:before="130" w:after="50"/>
+        <w:spacing w:before="120" w:after="50"/>
         <w:pBdr>
           <w:bottom w:val="single" w:sz="6" w:space="1" w:color="2E5AAC"/>
         </w:pBdr>
@@ -479,7 +589,7 @@
           <w:color w:val="1F3864"/>
           <w:sz w:val="22"/>
         </w:rPr>
-        <w:t>EDUCATION</w:t>
+        <w:t>EDUCATION &amp; CERTIFICATIONS</w:t>
       </w:r>
     </w:p>
     <w:p>
@@ -487,7 +597,7 @@
         <w:tabs>
           <w:tab w:pos="10546" w:val="right"/>
         </w:tabs>
-        <w:spacing w:after="50"/>
+        <w:spacing w:after="40"/>
       </w:pPr>
       <w:r>
         <w:rPr>
@@ -507,64 +617,19 @@
           <w:sz w:val="19"/>
         </w:rPr>
         <w:tab/>
-        <w:t>2019 – 2021</w:t>
+        <w:t>2018 – 2021</w:t>
       </w:r>
     </w:p>
     <w:p>
       <w:pPr>
-        <w:tabs>
-          <w:tab w:pos="10546" w:val="right"/>
-        </w:tabs>
-        <w:spacing w:after="50"/>
+        <w:spacing w:after="40"/>
       </w:pPr>
-      <w:r>
-        <w:rPr>
-          <w:rFonts w:ascii="Calibri" w:hAnsi="Calibri"/>
-          <w:b/>
-          <w:i w:val="0"/>
-          <w:sz w:val="19"/>
-        </w:rPr>
-        <w:t>Class XII (ISC), St. Thomas High School, Kanpur</w:t>
-      </w:r>
       <w:r>
         <w:rPr>
           <w:rFonts w:ascii="Calibri" w:hAnsi="Calibri"/>
           <w:b w:val="0"/>
           <w:i w:val="0"/>
           <w:color w:val="444444"/>
-          <w:sz w:val="19"/>
-        </w:rPr>
-        <w:tab/>
-        <w:t>2018</w:t>
-      </w:r>
-    </w:p>
-    <w:p>
-      <w:pPr>
-        <w:spacing w:before="130" w:after="50"/>
-        <w:pBdr>
-          <w:bottom w:val="single" w:sz="6" w:space="1" w:color="2E5AAC"/>
-        </w:pBdr>
-      </w:pPr>
-      <w:r>
-        <w:rPr>
-          <w:rFonts w:ascii="Calibri" w:hAnsi="Calibri"/>
-          <w:b/>
-          <w:color w:val="1F3864"/>
-          <w:sz w:val="22"/>
-        </w:rPr>
-        <w:t>CERTIFICATIONS</w:t>
-      </w:r>
-    </w:p>
-    <w:p>
-      <w:pPr>
-        <w:pStyle w:val="ListBullet"/>
-        <w:spacing w:after="50" w:before="0" w:line="266" w:lineRule="auto"/>
-      </w:pPr>
-      <w:r>
-        <w:rPr>
-          <w:rFonts w:ascii="Calibri" w:hAnsi="Calibri"/>
-          <w:b w:val="0"/>
-          <w:i w:val="0"/>
           <w:sz w:val="19"/>
         </w:rPr>
         <w:t>Product Management Certification — Udemy (2024)    •    JIRA Certification — Udemy (2024)</w:t>
@@ -944,7 +1009,7 @@
     <w:qFormat/>
     <w:rsid w:val="00FC693F"/>
     <w:pPr>
-      <w:spacing w:after="50" w:before="0" w:line="266" w:lineRule="auto"/>
+      <w:spacing w:after="40" w:before="0" w:line="254" w:lineRule="auto"/>
     </w:pPr>
     <w:rPr>
       <w:rFonts w:ascii="Calibri" w:hAnsi="Calibri"/>
@@ -1477,7 +1542,7 @@
       <w:numPr>
         <w:numId w:val="1"/>
       </w:numPr>
-      <w:spacing w:after="50" w:before="0" w:line="266" w:lineRule="auto"/>
+      <w:spacing w:after="40" w:before="0" w:line="254" w:lineRule="auto"/>
       <w:contextualSpacing/>
     </w:pPr>
     <w:rPr>

</xml_diff>

<commit_message>
Finalize master resume (Draft 5) + align dashboard resume tab & portfolio
Master: lead-across scope (drop 8+2 QA headcount), enabled ₹70L, surveyed 5/5,
self-serve enrolment 6%→12%/95% payment success, P&L causality, chatbot-attributed
RAG metrics, reworded analyst bullet, dropped Prompt Engineering + Udemy certs,
clickable portfolio, Education & Portfolio header, currency standardized to ₹.
index.html resumeDoc + portfolio.html funnel slide/hero updated to match — no conflicts.

Co-Authored-By: Claude Opus 4.8 <noreply@anthropic.com>
</commit_message>
<xml_diff>
--- a/resumes/Kshitiz Yadav - Product Manager Resume.docx
+++ b/resumes/Kshitiz Yadav - Product Manager Resume.docx
@@ -82,7 +82,7 @@
     </w:p>
     <w:p>
       <w:pPr>
-        <w:spacing w:after="40"/>
+        <w:spacing w:after="20"/>
         <w:jc w:val="center"/>
       </w:pPr>
       <w:r>
@@ -98,7 +98,7 @@
     </w:p>
     <w:p>
       <w:pPr>
-        <w:spacing w:before="120" w:after="50"/>
+        <w:spacing w:before="100" w:after="40"/>
         <w:pBdr>
           <w:bottom w:val="single" w:sz="6" w:space="1" w:color="2E5AAC"/>
         </w:pBdr>
@@ -115,7 +115,7 @@
     </w:p>
     <w:p>
       <w:pPr>
-        <w:spacing w:after="40"/>
+        <w:spacing w:after="20"/>
       </w:pPr>
       <w:r>
         <w:rPr>
@@ -124,12 +124,12 @@
           <w:i w:val="0"/>
           <w:sz w:val="19"/>
         </w:rPr>
-        <w:t>Product Manager with 5+ years of product experience building growth, monetization, payments, and workflow-automation products across consumer apps, a two-sided marketplace, CRM, and internal platforms serving 150,000+ enrolled users. Progressed from Senior Product Analyst to Assistant Product Manager to Product Manager — owning discovery, PRDs, prioritization, launch, and iteration with engineering, design, and business teams. Delivered 20% revenue growth, 25% ARPU expansion, ₹70L in product-led renewals in a single month, and 80% lower operational workload, using SQL, Power BI, and AI as force-multipliers.</w:t>
+        <w:t>Product Manager with 5+ years building growth, monetization, payments, and workflow-automation products across consumer apps, a two-sided marketplace, CRM, and internal platforms serving 150,000+ users. Progressed from Senior Product Analyst to Assistant Product Manager to Product Manager, owning discovery, PRDs, prioritization, launch, and iteration with engineering, design, and business teams. Combines SQL-led product analysis with hands-on execution across APIs, automation, and AI-assisted workflows.</w:t>
       </w:r>
     </w:p>
     <w:p>
       <w:pPr>
-        <w:spacing w:before="120" w:after="50"/>
+        <w:spacing w:before="100" w:after="40"/>
         <w:pBdr>
           <w:bottom w:val="single" w:sz="6" w:space="1" w:color="2E5AAC"/>
         </w:pBdr>
@@ -146,7 +146,7 @@
     </w:p>
     <w:p>
       <w:pPr>
-        <w:spacing w:after="40"/>
+        <w:spacing w:after="20"/>
       </w:pPr>
       <w:r>
         <w:rPr>
@@ -160,7 +160,7 @@
     </w:p>
     <w:p>
       <w:pPr>
-        <w:spacing w:before="120" w:after="50"/>
+        <w:spacing w:before="100" w:after="40"/>
         <w:pBdr>
           <w:bottom w:val="single" w:sz="6" w:space="1" w:color="2E5AAC"/>
         </w:pBdr>
@@ -191,7 +191,7 @@
     </w:p>
     <w:p>
       <w:pPr>
-        <w:spacing w:after="40"/>
+        <w:spacing w:after="20"/>
       </w:pPr>
       <w:r>
         <w:rPr>
@@ -209,7 +209,7 @@
         <w:tabs>
           <w:tab w:pos="10546" w:val="right"/>
         </w:tabs>
-        <w:spacing w:before="70" w:after="0"/>
+        <w:spacing w:before="60" w:after="0"/>
       </w:pPr>
       <w:r>
         <w:rPr>
@@ -236,7 +236,7 @@
     <w:p>
       <w:pPr>
         <w:pStyle w:val="ListBullet"/>
-        <w:spacing w:after="40" w:before="0" w:line="254" w:lineRule="auto"/>
+        <w:spacing w:after="20" w:before="0" w:line="240" w:lineRule="auto"/>
       </w:pPr>
       <w:r>
         <w:rPr>
@@ -245,13 +245,13 @@
           <w:i w:val="0"/>
           <w:sz w:val="19"/>
         </w:rPr>
-        <w:t>Own the full product suite — consumer app, student &amp; teacher LMS, advisor CRM, renewal engine, and in-house AI layer — for a platform with 150,000+ enrolled users and 30,000+ daily active users, leading a cross-functional squad of 8 engineers and 2 QA from discovery to launch.</w:t>
+        <w:t>Lead product planning and delivery across the full product suite — consumer app, student &amp; teacher LMS, advisor CRM, renewal engine, and in-house AI layer — for a platform with 150,000+ users and 30,000+ daily active users, working with a cross-functional squad of engineering, design, and QA from discovery to launch.</w:t>
       </w:r>
     </w:p>
     <w:p>
       <w:pPr>
         <w:pStyle w:val="ListBullet"/>
-        <w:spacing w:after="40" w:before="0" w:line="254" w:lineRule="auto"/>
+        <w:spacing w:after="20" w:before="0" w:line="240" w:lineRule="auto"/>
       </w:pPr>
       <w:r>
         <w:rPr>
@@ -260,13 +260,13 @@
           <w:i w:val="0"/>
           <w:sz w:val="19"/>
         </w:rPr>
-        <w:t>Designed an in-product renewal engine (nudges, early-bird access, LMS free-trial classes, teacher-initiated renewals) that reduced assisted-renewal cost and generated ₹70L in product-led renewals in a single month (Jan 2025).</w:t>
+        <w:t>Designed an in-product renewal engine (nudges, early-bird access, LMS free-trial classes, teacher-initiated renewals) that reduced assisted-renewal cost and enabled ₹70L in product-led renewals in a single month (Jan 2025).</w:t>
       </w:r>
     </w:p>
     <w:p>
       <w:pPr>
         <w:pStyle w:val="ListBullet"/>
-        <w:spacing w:after="40" w:before="0" w:line="254" w:lineRule="auto"/>
+        <w:spacing w:after="20" w:before="0" w:line="240" w:lineRule="auto"/>
       </w:pPr>
       <w:r>
         <w:rPr>
@@ -275,13 +275,13 @@
           <w:i w:val="0"/>
           <w:sz w:val="19"/>
         </w:rPr>
-        <w:t>Increased the share of enrolled users rating the product 5 out of 5 from 10% to 25% via onboarding and retention work: seamless onboarding, teacher PTMs and feedback, a one-page student-detail UI, a loyalty program, and the PSpark in-app wallet.</w:t>
+        <w:t>Increased the share of surveyed users reporting 5/5 satisfaction from 10% to 25% by redesigning onboarding, consolidating student progress into a single-page view, and adding structured teacher feedback.</w:t>
       </w:r>
     </w:p>
     <w:p>
       <w:pPr>
         <w:pStyle w:val="ListBullet"/>
-        <w:spacing w:after="40" w:before="0" w:line="254" w:lineRule="auto"/>
+        <w:spacing w:after="20" w:before="0" w:line="240" w:lineRule="auto"/>
       </w:pPr>
       <w:r>
         <w:rPr>
@@ -290,13 +290,13 @@
           <w:i w:val="0"/>
           <w:sz w:val="19"/>
         </w:rPr>
-        <w:t>Re-architected the sign-up → demo → enrolment funnel — single-step OTP, a preference-capture ranking model, and 6 API-integrated payment gateways with pre-filled links and auto-cleared approvals — enabling self-serve, plan-based purchase with no manual intervention.</w:t>
+        <w:t>Built a self-serve, product-led enrolment flow — post-demo course selection with best-fit ranking, single-step OTP, discounts, and 6 API-integrated payment gateways with auto-cleared approvals — letting customers purchase on their own; doubled the share of leads enrolling self-serve from 6% to 12% (at 95% payment success) over 12 months of iteration, reducing reliance on counselor- and teacher-assisted sales.</w:t>
       </w:r>
     </w:p>
     <w:p>
       <w:pPr>
         <w:pStyle w:val="ListBullet"/>
-        <w:spacing w:after="40" w:before="0" w:line="254" w:lineRule="auto"/>
+        <w:spacing w:after="20" w:before="0" w:line="240" w:lineRule="auto"/>
       </w:pPr>
       <w:r>
         <w:rPr>
@@ -305,13 +305,13 @@
           <w:i w:val="0"/>
           <w:sz w:val="19"/>
         </w:rPr>
-        <w:t>Built an advisor-wise P&amp;L tracker (weekly Net Revenue − Fixed, Refund, Marketing &amp; Sales cost) whose visibility drove profitability interventions — profitable advisors rose from 50 to 100 in one month and to 125 over the next two.</w:t>
+        <w:t>Built an advisor-wise weekly P&amp;L tracker (net revenue minus fixed, refund, marketing, and sales cost) whose visibility enabled targeted profitability interventions — profitable advisors rose from 50 to 100 in one month and to 125 over the next two.</w:t>
       </w:r>
     </w:p>
     <w:p>
       <w:pPr>
         <w:pStyle w:val="ListBullet"/>
-        <w:spacing w:after="40" w:before="0" w:line="254" w:lineRule="auto"/>
+        <w:spacing w:after="20" w:before="0" w:line="240" w:lineRule="auto"/>
       </w:pPr>
       <w:r>
         <w:rPr>
@@ -320,13 +320,13 @@
           <w:i w:val="0"/>
           <w:sz w:val="19"/>
         </w:rPr>
-        <w:t>Shipped a production GenAI learning layer (age-appropriate speech/text responses) and a RAG-based support chatbot — cutting first-response time from 4 minutes to under 10 seconds and monthly escalations from ~300 to under 50 within three months.</w:t>
+        <w:t>Shipped a production GenAI learning layer (age-appropriate speech/text responses) and launched a RAG-based support chatbot that cut first-response time from 4 minutes to under 10 seconds and monthly escalations from ~300 to under 50 within three months.</w:t>
       </w:r>
     </w:p>
     <w:p>
       <w:pPr>
         <w:pStyle w:val="ListBullet"/>
-        <w:spacing w:after="40" w:before="0" w:line="254" w:lineRule="auto"/>
+        <w:spacing w:after="20" w:before="0" w:line="240" w:lineRule="auto"/>
       </w:pPr>
       <w:r>
         <w:rPr>
@@ -335,7 +335,7 @@
           <w:i w:val="0"/>
           <w:sz w:val="19"/>
         </w:rPr>
-        <w:t>Ship minor and mid-level product features using AI-assisted development (Claude Code) — scoping, implementing, and testing changes, and raising merge requests for engineering review.</w:t>
+        <w:t>Prototype and ship scoped product improvements with Claude Code (AI-assisted development), implementing and testing changes before raising merge requests for engineering review.</w:t>
       </w:r>
     </w:p>
     <w:p>
@@ -343,7 +343,7 @@
         <w:tabs>
           <w:tab w:pos="10546" w:val="right"/>
         </w:tabs>
-        <w:spacing w:before="70" w:after="0"/>
+        <w:spacing w:before="60" w:after="0"/>
       </w:pPr>
       <w:r>
         <w:rPr>
@@ -370,7 +370,7 @@
     <w:p>
       <w:pPr>
         <w:pStyle w:val="ListBullet"/>
-        <w:spacing w:after="40" w:before="0" w:line="254" w:lineRule="auto"/>
+        <w:spacing w:after="20" w:before="0" w:line="240" w:lineRule="auto"/>
       </w:pPr>
       <w:r>
         <w:rPr>
@@ -385,7 +385,7 @@
     <w:p>
       <w:pPr>
         <w:pStyle w:val="ListBullet"/>
-        <w:spacing w:after="40" w:before="0" w:line="254" w:lineRule="auto"/>
+        <w:spacing w:after="20" w:before="0" w:line="240" w:lineRule="auto"/>
       </w:pPr>
       <w:r>
         <w:rPr>
@@ -400,7 +400,7 @@
     <w:p>
       <w:pPr>
         <w:pStyle w:val="ListBullet"/>
-        <w:spacing w:after="40" w:before="0" w:line="254" w:lineRule="auto"/>
+        <w:spacing w:after="20" w:before="0" w:line="240" w:lineRule="auto"/>
       </w:pPr>
       <w:r>
         <w:rPr>
@@ -415,7 +415,7 @@
     <w:p>
       <w:pPr>
         <w:pStyle w:val="ListBullet"/>
-        <w:spacing w:after="40" w:before="0" w:line="254" w:lineRule="auto"/>
+        <w:spacing w:after="20" w:before="0" w:line="240" w:lineRule="auto"/>
       </w:pPr>
       <w:r>
         <w:rPr>
@@ -432,7 +432,7 @@
         <w:tabs>
           <w:tab w:pos="10546" w:val="right"/>
         </w:tabs>
-        <w:spacing w:before="70" w:after="0"/>
+        <w:spacing w:before="60" w:after="0"/>
       </w:pPr>
       <w:r>
         <w:rPr>
@@ -459,7 +459,7 @@
     <w:p>
       <w:pPr>
         <w:pStyle w:val="ListBullet"/>
-        <w:spacing w:after="40" w:before="0" w:line="254" w:lineRule="auto"/>
+        <w:spacing w:after="20" w:before="0" w:line="240" w:lineRule="auto"/>
       </w:pPr>
       <w:r>
         <w:rPr>
@@ -468,13 +468,13 @@
           <w:i w:val="0"/>
           <w:sz w:val="19"/>
         </w:rPr>
-        <w:t>Developed SQL and Power BI reporting across growth, revenue, and operations; improved weekly revenue accuracy and created a data foundation for product and commercial decisions.</w:t>
+        <w:t>Built SQL and Power BI dashboards across acquisition, revenue, and operations, replacing fragmented weekly reporting with a consistent performance view used by product and commercial teams.</w:t>
       </w:r>
     </w:p>
     <w:p>
       <w:pPr>
         <w:pStyle w:val="ListBullet"/>
-        <w:spacing w:after="40" w:before="0" w:line="254" w:lineRule="auto"/>
+        <w:spacing w:after="20" w:before="0" w:line="240" w:lineRule="auto"/>
       </w:pPr>
       <w:r>
         <w:rPr>
@@ -488,7 +488,7 @@
     </w:p>
     <w:p>
       <w:pPr>
-        <w:spacing w:before="120" w:after="50"/>
+        <w:spacing w:before="100" w:after="40"/>
         <w:pBdr>
           <w:bottom w:val="single" w:sz="6" w:space="1" w:color="2E5AAC"/>
         </w:pBdr>
@@ -506,7 +506,7 @@
     <w:p>
       <w:pPr>
         <w:pStyle w:val="ListBullet"/>
-        <w:spacing w:after="40" w:before="0" w:line="254" w:lineRule="auto"/>
+        <w:spacing w:after="20" w:before="0" w:line="240" w:lineRule="auto"/>
       </w:pPr>
       <w:r>
         <w:rPr>
@@ -530,7 +530,7 @@
     <w:p>
       <w:pPr>
         <w:pStyle w:val="ListBullet"/>
-        <w:spacing w:after="40" w:before="0" w:line="254" w:lineRule="auto"/>
+        <w:spacing w:after="20" w:before="0" w:line="240" w:lineRule="auto"/>
       </w:pPr>
       <w:r>
         <w:rPr>
@@ -554,7 +554,7 @@
     <w:p>
       <w:pPr>
         <w:pStyle w:val="ListBullet"/>
-        <w:spacing w:after="40" w:before="0" w:line="254" w:lineRule="auto"/>
+        <w:spacing w:after="20" w:before="0" w:line="240" w:lineRule="auto"/>
       </w:pPr>
       <w:r>
         <w:rPr>
@@ -572,12 +572,12 @@
           <w:i w:val="0"/>
           <w:sz w:val="19"/>
         </w:rPr>
-        <w:t>OpenAI / Gemini / Claude APIs, Claude Code, Prompt Engineering, RAG, REST APIs, Payment Integrations</w:t>
+        <w:t>OpenAI / Gemini / Claude APIs, Claude Code, RAG, REST APIs, Payment Integrations</w:t>
       </w:r>
     </w:p>
     <w:p>
       <w:pPr>
-        <w:spacing w:before="120" w:after="50"/>
+        <w:spacing w:before="100" w:after="40"/>
         <w:pBdr>
           <w:bottom w:val="single" w:sz="6" w:space="1" w:color="2E5AAC"/>
         </w:pBdr>
@@ -589,7 +589,7 @@
           <w:color w:val="1F3864"/>
           <w:sz w:val="22"/>
         </w:rPr>
-        <w:t>EDUCATION &amp; CERTIFICATIONS</w:t>
+        <w:t>EDUCATION &amp; PORTFOLIO</w:t>
       </w:r>
     </w:p>
     <w:p>
@@ -597,7 +597,7 @@
         <w:tabs>
           <w:tab w:pos="10546" w:val="right"/>
         </w:tabs>
-        <w:spacing w:after="40"/>
+        <w:spacing w:after="20"/>
       </w:pPr>
       <w:r>
         <w:rPr>
@@ -622,7 +622,7 @@
     </w:p>
     <w:p>
       <w:pPr>
-        <w:spacing w:after="40"/>
+        <w:spacing w:after="20"/>
       </w:pPr>
       <w:r>
         <w:rPr>
@@ -632,8 +632,18 @@
           <w:color w:val="444444"/>
           <w:sz w:val="19"/>
         </w:rPr>
-        <w:t>Product Management Certification — Udemy (2024)    •    JIRA Certification — Udemy (2024)</w:t>
+        <w:t xml:space="preserve">Portfolio: </w:t>
       </w:r>
+      <w:hyperlink r:id="rId11">
+        <w:r>
+          <w:rPr>
+            <w:rFonts w:ascii="Calibri" w:hAnsi="Calibri"/>
+            <w:color w:val="444444"/>
+            <w:sz w:val="18"/>
+          </w:rPr>
+          <w:t xml:space="preserve">kshitizyadav788-svg.github.io/career-dashboard/portfolio.html</w:t>
+        </w:r>
+      </w:hyperlink>
     </w:p>
     <w:sectPr>
       <w:pgSz w:w="11906" w:h="16838"/>
@@ -1009,7 +1019,7 @@
     <w:qFormat/>
     <w:rsid w:val="00FC693F"/>
     <w:pPr>
-      <w:spacing w:after="40" w:before="0" w:line="254" w:lineRule="auto"/>
+      <w:spacing w:after="20" w:before="0" w:line="240" w:lineRule="auto"/>
     </w:pPr>
     <w:rPr>
       <w:rFonts w:ascii="Calibri" w:hAnsi="Calibri"/>
@@ -1542,7 +1552,7 @@
       <w:numPr>
         <w:numId w:val="1"/>
       </w:numPr>
-      <w:spacing w:after="40" w:before="0" w:line="254" w:lineRule="auto"/>
+      <w:spacing w:after="20" w:before="0" w:line="240" w:lineRule="auto"/>
       <w:contextualSpacing/>
     </w:pPr>
     <w:rPr>

</xml_diff>

<commit_message>
Add teacher-led enrolment channel bullet (₹30L→₹50L) to fill page + strengthen monetization story; mirror to dashboard
Co-Authored-By: Claude Opus 4.8 <noreply@anthropic.com>
</commit_message>
<xml_diff>
--- a/resumes/Kshitiz Yadav - Product Manager Resume.docx
+++ b/resumes/Kshitiz Yadav - Product Manager Resume.docx
@@ -291,6 +291,21 @@
           <w:sz w:val="19"/>
         </w:rPr>
         <w:t>Built a self-serve, product-led enrolment flow — post-demo course selection with best-fit ranking, single-step OTP, discounts, and 6 API-integrated payment gateways with auto-cleared approvals — letting customers purchase on their own; doubled the share of leads enrolling self-serve from 6% to 12% (at 95% payment success) over 12 months of iteration, reducing reliance on counselor- and teacher-assisted sales.</w:t>
+      </w:r>
+    </w:p>
+    <w:p>
+      <w:pPr>
+        <w:pStyle w:val="ListBullet"/>
+        <w:spacing w:after="20" w:before="0" w:line="240" w:lineRule="auto"/>
+      </w:pPr>
+      <w:r>
+        <w:rPr>
+          <w:rFonts w:ascii="Calibri" w:hAnsi="Calibri"/>
+          <w:b w:val="0"/>
+          <w:i w:val="0"/>
+          <w:sz w:val="19"/>
+        </w:rPr>
+        <w:t>Scaled a parallel teacher-led enrolment channel — teachers collect payment from customers during the demo session — growing its monthly revenue from ₹30L to ₹50L at ~20% conversion.</w:t>
       </w:r>
     </w:p>
     <w:p>

</xml_diff>